<commit_message>
Added Variables definition to the Manual
</commit_message>
<xml_diff>
--- a/Code Manual.docx
+++ b/Code Manual.docx
@@ -25,6 +25,9 @@
     </w:p>
     <w:p>
       <w:r>
+        <w:rPr>
+          <w:noProof/>
+        </w:rPr>
         <w:drawing>
           <wp:inline distT="0" distB="0" distL="0" distR="0" wp14:anchorId="1AA12DED" wp14:editId="1A0DA5D3">
             <wp:extent cx="5943600" cy="288925"/>
@@ -64,27 +67,14 @@
     </w:p>
     <w:p>
       <w:r>
-        <w:t xml:space="preserve">Click on the </w:t>
-      </w:r>
-      <w:proofErr w:type="gramStart"/>
-      <w:r>
-        <w:t>Senior-Project-Code</w:t>
-      </w:r>
-      <w:proofErr w:type="gramEnd"/>
-      <w:r>
-        <w:t xml:space="preserve"> </w:t>
-      </w:r>
-      <w:proofErr w:type="gramStart"/>
-      <w:r>
-        <w:t>if</w:t>
-      </w:r>
-      <w:proofErr w:type="gramEnd"/>
-      <w:r>
-        <w:t xml:space="preserve"> current material selected isn’t the material you need.</w:t>
-      </w:r>
-    </w:p>
-    <w:p>
-      <w:r>
+        <w:t>Click on the Senior-Project-Code if current material selected isn’t the material you need.</w:t>
+      </w:r>
+    </w:p>
+    <w:p>
+      <w:r>
+        <w:rPr>
+          <w:noProof/>
+        </w:rPr>
         <w:drawing>
           <wp:inline distT="0" distB="0" distL="0" distR="0" wp14:anchorId="7C32982F" wp14:editId="3C0538CA">
             <wp:extent cx="3817951" cy="365792"/>
@@ -129,6 +119,9 @@
     </w:p>
     <w:p>
       <w:r>
+        <w:rPr>
+          <w:noProof/>
+        </w:rPr>
         <w:drawing>
           <wp:inline distT="0" distB="0" distL="0" distR="0" wp14:anchorId="2E4F8718" wp14:editId="0A3DA93B">
             <wp:extent cx="5943600" cy="1852295"/>
@@ -173,6 +166,9 @@
     </w:p>
     <w:p>
       <w:r>
+        <w:rPr>
+          <w:noProof/>
+        </w:rPr>
         <w:drawing>
           <wp:inline distT="0" distB="0" distL="0" distR="0" wp14:anchorId="068D3301" wp14:editId="0F98BE48">
             <wp:extent cx="5943600" cy="312420"/>
@@ -228,6 +224,9 @@
         <w:t xml:space="preserve"> </w:t>
       </w:r>
       <w:r>
+        <w:rPr>
+          <w:noProof/>
+        </w:rPr>
         <w:drawing>
           <wp:inline distT="0" distB="0" distL="0" distR="0" wp14:anchorId="7C68F30D" wp14:editId="7ED7E7A0">
             <wp:extent cx="2781300" cy="2515650"/>
@@ -352,6 +351,1006 @@
           </wp:inline>
         </w:drawing>
       </w:r>
+    </w:p>
+    <w:p>
+      <w:pPr>
+        <w:rPr>
+          <w:noProof/>
+        </w:rPr>
+      </w:pPr>
+    </w:p>
+    <w:p>
+      <w:pPr>
+        <w:rPr>
+          <w:noProof/>
+        </w:rPr>
+      </w:pPr>
+    </w:p>
+    <w:p>
+      <w:pPr>
+        <w:rPr>
+          <w:noProof/>
+        </w:rPr>
+      </w:pPr>
+    </w:p>
+    <w:p>
+      <w:pPr>
+        <w:rPr>
+          <w:noProof/>
+        </w:rPr>
+      </w:pPr>
+    </w:p>
+    <w:p>
+      <w:pPr>
+        <w:rPr>
+          <w:noProof/>
+        </w:rPr>
+      </w:pPr>
+    </w:p>
+    <w:p>
+      <w:pPr>
+        <w:rPr>
+          <w:noProof/>
+        </w:rPr>
+      </w:pPr>
+    </w:p>
+    <w:p>
+      <w:pPr>
+        <w:rPr>
+          <w:noProof/>
+        </w:rPr>
+      </w:pPr>
+    </w:p>
+    <w:p>
+      <w:pPr>
+        <w:rPr>
+          <w:noProof/>
+        </w:rPr>
+      </w:pPr>
+    </w:p>
+    <w:p>
+      <w:pPr>
+        <w:rPr>
+          <w:noProof/>
+        </w:rPr>
+      </w:pPr>
+    </w:p>
+    <w:p>
+      <w:pPr>
+        <w:rPr>
+          <w:noProof/>
+        </w:rPr>
+      </w:pPr>
+    </w:p>
+    <w:p>
+      <w:pPr>
+        <w:rPr>
+          <w:noProof/>
+        </w:rPr>
+      </w:pPr>
+    </w:p>
+    <w:p>
+      <w:pPr>
+        <w:rPr>
+          <w:noProof/>
+        </w:rPr>
+      </w:pPr>
+    </w:p>
+    <w:p>
+      <w:pPr>
+        <w:jc w:val="center"/>
+        <w:rPr>
+          <w:noProof/>
+        </w:rPr>
+      </w:pPr>
+      <w:r>
+        <w:rPr>
+          <w:noProof/>
+        </w:rPr>
+        <w:lastRenderedPageBreak/>
+        <w:t>Variables</w:t>
+      </w:r>
+    </w:p>
+    <w:p>
+      <w:pPr>
+        <w:rPr>
+          <w:noProof/>
+        </w:rPr>
+      </w:pPr>
+      <w:r>
+        <w:rPr>
+          <w:noProof/>
+        </w:rPr>
+        <w:t xml:space="preserve">Concrete </w:t>
+      </w:r>
+      <w:r>
+        <w:rPr>
+          <w:noProof/>
+        </w:rPr>
+        <w:t>Beam Varriables</w:t>
+      </w:r>
+      <w:r>
+        <w:rPr>
+          <w:noProof/>
+        </w:rPr>
+        <w:t>:</w:t>
+      </w:r>
+    </w:p>
+    <w:p>
+      <w:pPr>
+        <w:rPr>
+          <w:noProof/>
+        </w:rPr>
+      </w:pPr>
+      <w:r>
+        <w:rPr>
+          <w:noProof/>
+        </w:rPr>
+        <w:t xml:space="preserve">aggergate size: Size of aggeragate used in </w:t>
+      </w:r>
+      <w:r>
+        <w:rPr>
+          <w:noProof/>
+        </w:rPr>
+        <w:t>concrete in (in.)</w:t>
+      </w:r>
+    </w:p>
+    <w:p>
+      <w:pPr>
+        <w:rPr>
+          <w:noProof/>
+        </w:rPr>
+      </w:pPr>
+      <w:r>
+        <w:rPr>
+          <w:noProof/>
+        </w:rPr>
+        <w:t>b:</w:t>
+      </w:r>
+      <w:r>
+        <w:rPr>
+          <w:noProof/>
+        </w:rPr>
+        <w:t xml:space="preserve"> The width of the</w:t>
+      </w:r>
+      <w:r>
+        <w:rPr>
+          <w:noProof/>
+        </w:rPr>
+        <w:t xml:space="preserve"> beam being analyzed in (in.)</w:t>
+      </w:r>
+    </w:p>
+    <w:p>
+      <w:pPr>
+        <w:rPr>
+          <w:noProof/>
+        </w:rPr>
+      </w:pPr>
+      <w:r>
+        <w:rPr>
+          <w:noProof/>
+        </w:rPr>
+        <w:t xml:space="preserve">bands: The different groupings of the </w:t>
+      </w:r>
+      <w:r>
+        <w:rPr>
+          <w:noProof/>
+        </w:rPr>
+        <w:t>stirrups.</w:t>
+      </w:r>
+    </w:p>
+    <w:p>
+      <w:pPr>
+        <w:rPr>
+          <w:noProof/>
+        </w:rPr>
+      </w:pPr>
+      <w:r>
+        <w:rPr>
+          <w:noProof/>
+        </w:rPr>
+        <w:t xml:space="preserve">bending: </w:t>
+      </w:r>
+      <w:r>
+        <w:rPr>
+          <w:noProof/>
+        </w:rPr>
+        <w:t>For non rectangular sections is the beam bending positively or negativley.</w:t>
+      </w:r>
+    </w:p>
+    <w:p>
+      <w:pPr>
+        <w:rPr>
+          <w:noProof/>
+        </w:rPr>
+      </w:pPr>
+      <w:r>
+        <w:rPr>
+          <w:noProof/>
+        </w:rPr>
+        <w:t>cover: The amount of concrete covering any rebar from the air in (in.)</w:t>
+      </w:r>
+    </w:p>
+    <w:p>
+      <w:pPr>
+        <w:rPr>
+          <w:noProof/>
+        </w:rPr>
+      </w:pPr>
+      <w:r>
+        <w:rPr>
+          <w:noProof/>
+        </w:rPr>
+        <w:t>d:</w:t>
+      </w:r>
+      <w:r>
+        <w:rPr>
+          <w:noProof/>
+        </w:rPr>
+        <w:t xml:space="preserve"> The height from the top of the compression face to the mid</w:t>
+      </w:r>
+      <w:r>
+        <w:rPr>
+          <w:noProof/>
+        </w:rPr>
+        <w:t xml:space="preserve"> depth of the rebar</w:t>
+      </w:r>
+      <w:r>
+        <w:rPr>
+          <w:noProof/>
+        </w:rPr>
+        <w:t xml:space="preserve"> in (in.)</w:t>
+      </w:r>
+    </w:p>
+    <w:p>
+      <w:pPr>
+        <w:rPr>
+          <w:noProof/>
+        </w:rPr>
+      </w:pPr>
+      <w:r>
+        <w:rPr>
+          <w:noProof/>
+        </w:rPr>
+        <w:t>d1:</w:t>
+      </w:r>
+      <w:r>
+        <w:rPr>
+          <w:noProof/>
+        </w:rPr>
+        <w:t xml:space="preserve"> The height from the top of the compression face to the mid depth of the first layer of rebar in (in.)</w:t>
+      </w:r>
+    </w:p>
+    <w:p>
+      <w:pPr>
+        <w:rPr>
+          <w:noProof/>
+        </w:rPr>
+      </w:pPr>
+      <w:r>
+        <w:rPr>
+          <w:noProof/>
+        </w:rPr>
+        <w:t>d2:</w:t>
+      </w:r>
+      <w:r>
+        <w:rPr>
+          <w:noProof/>
+        </w:rPr>
+        <w:t xml:space="preserve"> </w:t>
+      </w:r>
+      <w:r>
+        <w:rPr>
+          <w:noProof/>
+        </w:rPr>
+        <w:t>The height from the top of the compression face to the mid depth of the second layer of rebar in (in.)</w:t>
+      </w:r>
+    </w:p>
+    <w:p>
+      <w:pPr>
+        <w:rPr>
+          <w:noProof/>
+        </w:rPr>
+      </w:pPr>
+      <w:r>
+        <w:rPr>
+          <w:noProof/>
+        </w:rPr>
+        <w:t>f’c:</w:t>
+      </w:r>
+      <w:r>
+        <w:rPr>
+          <w:noProof/>
+        </w:rPr>
+        <w:t xml:space="preserve"> Compressive</w:t>
+      </w:r>
+      <w:r>
+        <w:rPr>
+          <w:noProof/>
+        </w:rPr>
+        <w:t xml:space="preserve"> yield strength of the concrete in (psi.)</w:t>
+      </w:r>
+    </w:p>
+    <w:p>
+      <w:pPr>
+        <w:rPr>
+          <w:noProof/>
+        </w:rPr>
+      </w:pPr>
+      <w:r>
+        <w:rPr>
+          <w:noProof/>
+        </w:rPr>
+        <w:t>fy:</w:t>
+      </w:r>
+      <w:r>
+        <w:rPr>
+          <w:noProof/>
+        </w:rPr>
+        <w:t xml:space="preserve"> Yeild strength of the </w:t>
+      </w:r>
+      <w:r>
+        <w:rPr>
+          <w:noProof/>
+        </w:rPr>
+        <w:t>flexural</w:t>
+      </w:r>
+      <w:r>
+        <w:rPr>
+          <w:noProof/>
+        </w:rPr>
+        <w:t xml:space="preserve"> </w:t>
+      </w:r>
+      <w:r>
+        <w:rPr>
+          <w:noProof/>
+        </w:rPr>
+        <w:t>steel</w:t>
+      </w:r>
+      <w:r>
+        <w:rPr>
+          <w:noProof/>
+        </w:rPr>
+        <w:t xml:space="preserve"> in (ksi)</w:t>
+      </w:r>
+    </w:p>
+    <w:p>
+      <w:pPr>
+        <w:rPr>
+          <w:noProof/>
+        </w:rPr>
+      </w:pPr>
+      <w:r>
+        <w:rPr>
+          <w:noProof/>
+        </w:rPr>
+        <w:t>fy: Yeild strength of the shear steel in (ksi)</w:t>
+      </w:r>
+    </w:p>
+    <w:p>
+      <w:pPr>
+        <w:rPr>
+          <w:noProof/>
+        </w:rPr>
+      </w:pPr>
+      <w:r>
+        <w:rPr>
+          <w:noProof/>
+        </w:rPr>
+        <w:t>h:</w:t>
+      </w:r>
+      <w:r>
+        <w:rPr>
+          <w:noProof/>
+        </w:rPr>
+        <w:t xml:space="preserve"> The height of the beam being analyzed in (in.)</w:t>
+      </w:r>
+    </w:p>
+    <w:p>
+      <w:pPr>
+        <w:rPr>
+          <w:noProof/>
+        </w:rPr>
+      </w:pPr>
+      <w:r>
+        <w:rPr>
+          <w:noProof/>
+        </w:rPr>
+        <w:t>length total: The full length of the beam in (ft.)</w:t>
+      </w:r>
+    </w:p>
+    <w:p>
+      <w:pPr>
+        <w:rPr>
+          <w:noProof/>
+        </w:rPr>
+      </w:pPr>
+      <w:r>
+        <w:rPr>
+          <w:noProof/>
+        </w:rPr>
+        <w:t>live load percent sustained: The</w:t>
+      </w:r>
+      <w:r>
+        <w:rPr>
+          <w:noProof/>
+        </w:rPr>
+        <w:t xml:space="preserve"> percent of live load applicable after the concrete is dry in (%.)</w:t>
+      </w:r>
+    </w:p>
+    <w:p>
+      <w:pPr>
+        <w:rPr>
+          <w:noProof/>
+        </w:rPr>
+      </w:pPr>
+      <w:r>
+        <w:rPr>
+          <w:noProof/>
+        </w:rPr>
+        <w:t>Nu: Any outside compressive force on the beam in (k.)</w:t>
+      </w:r>
+    </w:p>
+    <w:p>
+      <w:pPr>
+        <w:rPr>
+          <w:noProof/>
+        </w:rPr>
+      </w:pPr>
+      <w:r>
+        <w:rPr>
+          <w:noProof/>
+        </w:rPr>
+        <w:t>number of rebar: The number of rebar bars in the beam.</w:t>
+      </w:r>
+    </w:p>
+    <w:p>
+      <w:pPr>
+        <w:rPr>
+          <w:noProof/>
+        </w:rPr>
+      </w:pPr>
+      <w:r>
+        <w:rPr>
+          <w:noProof/>
+        </w:rPr>
+        <w:t>rebar size:</w:t>
+      </w:r>
+      <w:r>
+        <w:rPr>
+          <w:noProof/>
+        </w:rPr>
+        <w:t xml:space="preserve"> The size of the rebar in the beam</w:t>
+      </w:r>
+      <w:r>
+        <w:rPr>
+          <w:noProof/>
+        </w:rPr>
+        <w:t xml:space="preserve"> provided range is 3-11.</w:t>
+      </w:r>
+    </w:p>
+    <w:p>
+      <w:pPr>
+        <w:rPr>
+          <w:noProof/>
+        </w:rPr>
+      </w:pPr>
+      <w:r>
+        <w:rPr>
+          <w:noProof/>
+        </w:rPr>
+        <w:t>spacing: The distance between the</w:t>
+      </w:r>
+      <w:r>
+        <w:rPr>
+          <w:noProof/>
+        </w:rPr>
+        <w:t xml:space="preserve"> rebar in (in.)</w:t>
+      </w:r>
+    </w:p>
+    <w:p>
+      <w:pPr>
+        <w:rPr>
+          <w:noProof/>
+        </w:rPr>
+      </w:pPr>
+      <w:r>
+        <w:rPr>
+          <w:noProof/>
+        </w:rPr>
+        <w:t>stirrup leggs: The number of leggs a s</w:t>
+      </w:r>
+      <w:r>
+        <w:rPr>
+          <w:noProof/>
+        </w:rPr>
+        <w:t>tirrup has.</w:t>
+      </w:r>
+    </w:p>
+    <w:p>
+      <w:pPr>
+        <w:rPr>
+          <w:noProof/>
+        </w:rPr>
+      </w:pPr>
+      <w:r>
+        <w:rPr>
+          <w:noProof/>
+        </w:rPr>
+        <w:t>time dependent varriable: per ACI</w:t>
+      </w:r>
+      <w:r>
+        <w:rPr>
+          <w:noProof/>
+        </w:rPr>
+        <w:t>18-19(22)</w:t>
+      </w:r>
+      <w:r>
+        <w:rPr>
+          <w:noProof/>
+        </w:rPr>
+        <w:t xml:space="preserve"> table </w:t>
+      </w:r>
+      <w:r>
+        <w:rPr>
+          <w:noProof/>
+        </w:rPr>
+        <w:t>24.2.4.1.3.</w:t>
+      </w:r>
+    </w:p>
+    <w:p>
+      <w:pPr>
+        <w:rPr>
+          <w:noProof/>
+        </w:rPr>
+      </w:pPr>
+      <w:r>
+        <w:rPr>
+          <w:noProof/>
+        </w:rPr>
+        <w:t>weight of concete: The cubic weight of the concrete in (pcf</w:t>
+      </w:r>
+      <w:r>
+        <w:rPr>
+          <w:noProof/>
+        </w:rPr>
+        <w:t>.)</w:t>
+      </w:r>
+    </w:p>
+    <w:p>
+      <w:pPr>
+        <w:rPr>
+          <w:noProof/>
+        </w:rPr>
+      </w:pPr>
+      <w:r>
+        <w:rPr>
+          <w:noProof/>
+        </w:rPr>
+        <w:t>Vu</w:t>
+      </w:r>
+      <w:r>
+        <w:rPr>
+          <w:noProof/>
+        </w:rPr>
+        <w:t>: The maximum shear in the beam in (k.)</w:t>
+      </w:r>
+    </w:p>
+    <w:p>
+      <w:pPr>
+        <w:rPr>
+          <w:noProof/>
+        </w:rPr>
+      </w:pPr>
+      <w:r>
+        <w:rPr>
+          <w:noProof/>
+        </w:rPr>
+        <w:lastRenderedPageBreak/>
+        <w:t>CMU Varriables:</w:t>
+      </w:r>
+    </w:p>
+    <w:p>
+      <w:pPr>
+        <w:rPr>
+          <w:noProof/>
+        </w:rPr>
+      </w:pPr>
+      <w:r>
+        <w:rPr>
+          <w:noProof/>
+        </w:rPr>
+        <w:t>Bar count horizontal: The number of bars going along the beam.</w:t>
+      </w:r>
+    </w:p>
+    <w:p>
+      <w:pPr>
+        <w:rPr>
+          <w:noProof/>
+        </w:rPr>
+      </w:pPr>
+      <w:r>
+        <w:rPr>
+          <w:noProof/>
+        </w:rPr>
+        <w:t>Bar size horizontal: The size of the bar going along the beam.</w:t>
+      </w:r>
+    </w:p>
+    <w:p>
+      <w:pPr>
+        <w:rPr>
+          <w:noProof/>
+        </w:rPr>
+      </w:pPr>
+      <w:r>
+        <w:rPr>
+          <w:noProof/>
+        </w:rPr>
+        <w:t>Bar size vertical: The size of the bar going vertically in the beam.</w:t>
+      </w:r>
+    </w:p>
+    <w:p>
+      <w:pPr>
+        <w:rPr>
+          <w:noProof/>
+        </w:rPr>
+      </w:pPr>
+      <w:r>
+        <w:rPr>
+          <w:noProof/>
+        </w:rPr>
+        <w:t>Beam Courses: The number of CMU bricks stacked that are in the beam.</w:t>
+      </w:r>
+    </w:p>
+    <w:p>
+      <w:pPr>
+        <w:rPr>
+          <w:noProof/>
+        </w:rPr>
+      </w:pPr>
+      <w:r>
+        <w:rPr>
+          <w:noProof/>
+        </w:rPr>
+        <w:t>CMU Size: The block size in the form _x_x_ with _ in (in.)</w:t>
+      </w:r>
+    </w:p>
+    <w:p>
+      <w:pPr>
+        <w:rPr>
+          <w:noProof/>
+        </w:rPr>
+      </w:pPr>
+      <w:r>
+        <w:rPr>
+          <w:noProof/>
+        </w:rPr>
+        <w:t xml:space="preserve">Dead load: Any </w:t>
+      </w:r>
+      <w:r>
+        <w:rPr>
+          <w:noProof/>
+        </w:rPr>
+        <w:t>perminate load that doesn’t include self weight. Units as asked for.</w:t>
+      </w:r>
+    </w:p>
+    <w:p>
+      <w:pPr>
+        <w:rPr>
+          <w:noProof/>
+        </w:rPr>
+      </w:pPr>
+      <w:r>
+        <w:rPr>
+          <w:noProof/>
+        </w:rPr>
+        <w:t>Es: Modulus of Elasticity. SHOULDN’T NEED TO CHANGE.</w:t>
+      </w:r>
+    </w:p>
+    <w:p>
+      <w:pPr>
+        <w:rPr>
+          <w:noProof/>
+        </w:rPr>
+      </w:pPr>
+      <w:r>
+        <w:rPr>
+          <w:noProof/>
+        </w:rPr>
+        <w:t>Floor depth: How far the beam supports the wall</w:t>
+      </w:r>
+      <w:r>
+        <w:rPr>
+          <w:noProof/>
+        </w:rPr>
+        <w:t>. The trib depth. Units (ft.)</w:t>
+      </w:r>
+    </w:p>
+    <w:p>
+      <w:pPr>
+        <w:rPr>
+          <w:noProof/>
+        </w:rPr>
+      </w:pPr>
+      <w:r>
+        <w:rPr>
+          <w:noProof/>
+        </w:rPr>
+        <w:t>fm = compressive strength of the CMU in (ksi.)</w:t>
+      </w:r>
+    </w:p>
+    <w:p>
+      <w:pPr>
+        <w:rPr>
+          <w:noProof/>
+        </w:rPr>
+      </w:pPr>
+      <w:r>
+        <w:rPr>
+          <w:noProof/>
+        </w:rPr>
+        <w:t>fy: Yeild strength of the steel in (ksi</w:t>
+      </w:r>
+      <w:r>
+        <w:rPr>
+          <w:noProof/>
+        </w:rPr>
+        <w:t>.</w:t>
+      </w:r>
+      <w:r>
+        <w:rPr>
+          <w:noProof/>
+        </w:rPr>
+        <w:t>)</w:t>
+      </w:r>
+    </w:p>
+    <w:p>
+      <w:pPr>
+        <w:rPr>
+          <w:noProof/>
+        </w:rPr>
+      </w:pPr>
+      <w:r>
+        <w:rPr>
+          <w:noProof/>
+        </w:rPr>
+        <w:t>gap: The distance you want between the rebar and the face of the</w:t>
+      </w:r>
+      <w:r>
+        <w:rPr>
+          <w:noProof/>
+        </w:rPr>
+        <w:t xml:space="preserve"> CMU in (in.)</w:t>
+      </w:r>
+    </w:p>
+    <w:p>
+      <w:pPr>
+        <w:rPr>
+          <w:noProof/>
+        </w:rPr>
+      </w:pPr>
+      <w:r>
+        <w:rPr>
+          <w:noProof/>
+        </w:rPr>
+        <w:t>Grout fill: The patern in which grout is placed in the CMU.</w:t>
+      </w:r>
+    </w:p>
+    <w:p>
+      <w:pPr>
+        <w:rPr>
+          <w:noProof/>
+        </w:rPr>
+      </w:pPr>
+      <w:r>
+        <w:rPr>
+          <w:noProof/>
+        </w:rPr>
+        <w:t>Length: The length of the beam</w:t>
+      </w:r>
+      <w:r>
+        <w:rPr>
+          <w:noProof/>
+        </w:rPr>
+        <w:t>s span in (ft.) DON’T include bearing.</w:t>
+      </w:r>
+    </w:p>
+    <w:p>
+      <w:pPr>
+        <w:rPr>
+          <w:noProof/>
+        </w:rPr>
+      </w:pPr>
+      <w:r>
+        <w:rPr>
+          <w:noProof/>
+        </w:rPr>
+        <w:t>Length Bearing: The length of bearing of the beam</w:t>
+      </w:r>
+      <w:r>
+        <w:rPr>
+          <w:noProof/>
+        </w:rPr>
+        <w:t xml:space="preserve"> in (in.)</w:t>
+      </w:r>
+    </w:p>
+    <w:p>
+      <w:pPr>
+        <w:rPr>
+          <w:noProof/>
+        </w:rPr>
+      </w:pPr>
+      <w:r>
+        <w:rPr>
+          <w:noProof/>
+        </w:rPr>
+        <w:t xml:space="preserve">Mortar type: </w:t>
+      </w:r>
+      <w:r>
+        <w:rPr>
+          <w:noProof/>
+        </w:rPr>
+        <w:t>Type of mortar</w:t>
+      </w:r>
+      <w:r>
+        <w:rPr>
+          <w:noProof/>
+        </w:rPr>
+        <w:t xml:space="preserve"> used to bond the CMU. Options are </w:t>
+      </w:r>
+      <w:r>
+        <w:rPr>
+          <w:noProof/>
+        </w:rPr>
+        <w:t>M, S, N</w:t>
+      </w:r>
+      <w:r>
+        <w:rPr>
+          <w:noProof/>
+        </w:rPr>
+        <w:t>.</w:t>
+      </w:r>
+    </w:p>
+    <w:p>
+      <w:pPr>
+        <w:rPr>
+          <w:noProof/>
+        </w:rPr>
+      </w:pPr>
+      <w:r>
+        <w:rPr>
+          <w:noProof/>
+        </w:rPr>
+        <w:t>Number of Courses: The number of bricks above the beam, doesn’t include what is in the beam</w:t>
+      </w:r>
+      <w:r>
+        <w:rPr>
+          <w:noProof/>
+        </w:rPr>
+        <w:t>.</w:t>
+      </w:r>
+    </w:p>
+    <w:p>
+      <w:pPr>
+        <w:rPr>
+          <w:noProof/>
+        </w:rPr>
+      </w:pPr>
+      <w:r>
+        <w:rPr>
+          <w:noProof/>
+        </w:rPr>
+        <w:t xml:space="preserve">Point load: </w:t>
+      </w:r>
+      <w:r>
+        <w:rPr>
+          <w:noProof/>
+        </w:rPr>
+        <w:t xml:space="preserve">Must be factored and may lead to </w:t>
+      </w:r>
+      <w:r>
+        <w:rPr>
+          <w:noProof/>
+          <w:color w:val="EE0000"/>
+        </w:rPr>
+        <w:t xml:space="preserve">error </w:t>
+      </w:r>
+      <w:r>
+        <w:rPr>
+          <w:noProof/>
+        </w:rPr>
+        <w:t xml:space="preserve">since it </w:t>
+      </w:r>
+      <w:r>
+        <w:rPr>
+          <w:noProof/>
+        </w:rPr>
+        <w:t>is</w:t>
+      </w:r>
+      <w:r>
+        <w:rPr>
+          <w:noProof/>
+        </w:rPr>
+        <w:t xml:space="preserve"> not implemented for </w:t>
+      </w:r>
+      <w:r>
+        <w:rPr>
+          <w:noProof/>
+        </w:rPr>
+        <w:t>arching action.</w:t>
+      </w:r>
+    </w:p>
+    <w:p>
+      <w:pPr>
+        <w:rPr>
+          <w:noProof/>
+        </w:rPr>
+      </w:pPr>
+      <w:r>
+        <w:rPr>
+          <w:noProof/>
+        </w:rPr>
+        <w:t>Self load: Any lo</w:t>
+      </w:r>
+      <w:r>
+        <w:rPr>
+          <w:noProof/>
+        </w:rPr>
+        <w:t>ad from occupancy.</w:t>
+      </w:r>
+      <w:r>
+        <w:rPr>
+          <w:noProof/>
+        </w:rPr>
+        <w:t xml:space="preserve"> Units as aked for.</w:t>
+      </w:r>
+    </w:p>
+    <w:p>
+      <w:pPr>
+        <w:rPr>
+          <w:noProof/>
+        </w:rPr>
+      </w:pPr>
+      <w:r>
+        <w:rPr>
+          <w:noProof/>
+        </w:rPr>
+        <w:t>Space: The gap between the vertical bars in (in.)</w:t>
+      </w:r>
+    </w:p>
+    <w:p>
+      <w:pPr>
+        <w:rPr>
+          <w:noProof/>
+        </w:rPr>
+      </w:pPr>
+      <w:r>
+        <w:rPr>
+          <w:noProof/>
+        </w:rPr>
+        <w:t>Support: What is the beams support condition. Either Cantilever or Simply Supported.</w:t>
+      </w:r>
+    </w:p>
+    <w:p>
+      <w:pPr>
+        <w:rPr>
+          <w:noProof/>
+        </w:rPr>
+      </w:pPr>
+    </w:p>
+    <w:p>
+      <w:pPr>
+        <w:rPr>
+          <w:noProof/>
+        </w:rPr>
+      </w:pPr>
+    </w:p>
+    <w:p>
+      <w:pPr>
+        <w:rPr>
+          <w:noProof/>
+        </w:rPr>
+      </w:pPr>
     </w:p>
     <w:p/>
     <w:sectPr>

</xml_diff>

<commit_message>
Added diagrams for distance varriables.
</commit_message>
<xml_diff>
--- a/Code Manual.docx
+++ b/Code Manual.docx
@@ -546,6 +546,53 @@
         <w:rPr>
           <w:noProof/>
         </w:rPr>
+        <w:drawing>
+          <wp:inline distT="0" distB="0" distL="0" distR="0" wp14:anchorId="6D824898" wp14:editId="384EEB26">
+            <wp:extent cx="1102654" cy="2042160"/>
+            <wp:effectExtent l="0" t="0" r="2540" b="0"/>
+            <wp:docPr id="1656480162" name="Picture 1"/>
+            <wp:cNvGraphicFramePr>
+              <a:graphicFrameLocks xmlns:a="http://schemas.openxmlformats.org/drawingml/2006/main" noChangeAspect="1"/>
+            </wp:cNvGraphicFramePr>
+            <a:graphic xmlns:a="http://schemas.openxmlformats.org/drawingml/2006/main">
+              <a:graphicData uri="http://schemas.openxmlformats.org/drawingml/2006/picture">
+                <pic:pic xmlns:pic="http://schemas.openxmlformats.org/drawingml/2006/picture">
+                  <pic:nvPicPr>
+                    <pic:cNvPr id="1656480162" name=""/>
+                    <pic:cNvPicPr/>
+                  </pic:nvPicPr>
+                  <pic:blipFill>
+                    <a:blip r:embed="rId10"/>
+                    <a:stretch>
+                      <a:fillRect/>
+                    </a:stretch>
+                  </pic:blipFill>
+                  <pic:spPr>
+                    <a:xfrm>
+                      <a:off x="0" y="0"/>
+                      <a:ext cx="1108042" cy="2052140"/>
+                    </a:xfrm>
+                    <a:prstGeom prst="rect">
+                      <a:avLst/>
+                    </a:prstGeom>
+                  </pic:spPr>
+                </pic:pic>
+              </a:graphicData>
+            </a:graphic>
+          </wp:inline>
+        </w:drawing>
+      </w:r>
+    </w:p>
+    <w:p>
+      <w:pPr>
+        <w:rPr>
+          <w:noProof/>
+        </w:rPr>
+      </w:pPr>
+      <w:r>
+        <w:rPr>
+          <w:noProof/>
+        </w:rPr>
         <w:t xml:space="preserve">bands: The different groupings of the </w:t>
       </w:r>
       <w:r>
@@ -597,6 +644,53 @@
         <w:rPr>
           <w:noProof/>
         </w:rPr>
+        <w:drawing>
+          <wp:inline distT="0" distB="0" distL="0" distR="0" wp14:anchorId="6F7F14FC" wp14:editId="65E04A3A">
+            <wp:extent cx="1011238" cy="1866900"/>
+            <wp:effectExtent l="0" t="0" r="0" b="0"/>
+            <wp:docPr id="1975757462" name="Picture 1"/>
+            <wp:cNvGraphicFramePr>
+              <a:graphicFrameLocks xmlns:a="http://schemas.openxmlformats.org/drawingml/2006/main" noChangeAspect="1"/>
+            </wp:cNvGraphicFramePr>
+            <a:graphic xmlns:a="http://schemas.openxmlformats.org/drawingml/2006/main">
+              <a:graphicData uri="http://schemas.openxmlformats.org/drawingml/2006/picture">
+                <pic:pic xmlns:pic="http://schemas.openxmlformats.org/drawingml/2006/picture">
+                  <pic:nvPicPr>
+                    <pic:cNvPr id="1975757462" name=""/>
+                    <pic:cNvPicPr/>
+                  </pic:nvPicPr>
+                  <pic:blipFill>
+                    <a:blip r:embed="rId11"/>
+                    <a:stretch>
+                      <a:fillRect/>
+                    </a:stretch>
+                  </pic:blipFill>
+                  <pic:spPr>
+                    <a:xfrm>
+                      <a:off x="0" y="0"/>
+                      <a:ext cx="1014581" cy="1873072"/>
+                    </a:xfrm>
+                    <a:prstGeom prst="rect">
+                      <a:avLst/>
+                    </a:prstGeom>
+                  </pic:spPr>
+                </pic:pic>
+              </a:graphicData>
+            </a:graphic>
+          </wp:inline>
+        </w:drawing>
+      </w:r>
+    </w:p>
+    <w:p>
+      <w:pPr>
+        <w:rPr>
+          <w:noProof/>
+        </w:rPr>
+      </w:pPr>
+      <w:r>
+        <w:rPr>
+          <w:noProof/>
+        </w:rPr>
         <w:t>d:</w:t>
       </w:r>
       <w:r>
@@ -628,6 +722,54 @@
         <w:rPr>
           <w:noProof/>
         </w:rPr>
+        <w:drawing>
+          <wp:inline distT="0" distB="0" distL="0" distR="0" wp14:anchorId="0B5080E8" wp14:editId="6694515B">
+            <wp:extent cx="885306" cy="1508760"/>
+            <wp:effectExtent l="0" t="0" r="0" b="0"/>
+            <wp:docPr id="1166668057" name="Picture 1"/>
+            <wp:cNvGraphicFramePr>
+              <a:graphicFrameLocks xmlns:a="http://schemas.openxmlformats.org/drawingml/2006/main" noChangeAspect="1"/>
+            </wp:cNvGraphicFramePr>
+            <a:graphic xmlns:a="http://schemas.openxmlformats.org/drawingml/2006/main">
+              <a:graphicData uri="http://schemas.openxmlformats.org/drawingml/2006/picture">
+                <pic:pic xmlns:pic="http://schemas.openxmlformats.org/drawingml/2006/picture">
+                  <pic:nvPicPr>
+                    <pic:cNvPr id="1166668057" name=""/>
+                    <pic:cNvPicPr/>
+                  </pic:nvPicPr>
+                  <pic:blipFill>
+                    <a:blip r:embed="rId12"/>
+                    <a:stretch>
+                      <a:fillRect/>
+                    </a:stretch>
+                  </pic:blipFill>
+                  <pic:spPr>
+                    <a:xfrm>
+                      <a:off x="0" y="0"/>
+                      <a:ext cx="892672" cy="1521313"/>
+                    </a:xfrm>
+                    <a:prstGeom prst="rect">
+                      <a:avLst/>
+                    </a:prstGeom>
+                  </pic:spPr>
+                </pic:pic>
+              </a:graphicData>
+            </a:graphic>
+          </wp:inline>
+        </w:drawing>
+      </w:r>
+    </w:p>
+    <w:p>
+      <w:pPr>
+        <w:rPr>
+          <w:noProof/>
+        </w:rPr>
+      </w:pPr>
+      <w:r>
+        <w:rPr>
+          <w:noProof/>
+        </w:rPr>
+        <w:lastRenderedPageBreak/>
         <w:t>d1:</w:t>
       </w:r>
       <w:r>
@@ -672,6 +814,53 @@
         <w:rPr>
           <w:noProof/>
         </w:rPr>
+        <w:drawing>
+          <wp:inline distT="0" distB="0" distL="0" distR="0" wp14:anchorId="52B48BC2" wp14:editId="55C1BED0">
+            <wp:extent cx="1429592" cy="1790700"/>
+            <wp:effectExtent l="0" t="0" r="0" b="0"/>
+            <wp:docPr id="1459280952" name="Picture 1"/>
+            <wp:cNvGraphicFramePr>
+              <a:graphicFrameLocks xmlns:a="http://schemas.openxmlformats.org/drawingml/2006/main" noChangeAspect="1"/>
+            </wp:cNvGraphicFramePr>
+            <a:graphic xmlns:a="http://schemas.openxmlformats.org/drawingml/2006/main">
+              <a:graphicData uri="http://schemas.openxmlformats.org/drawingml/2006/picture">
+                <pic:pic xmlns:pic="http://schemas.openxmlformats.org/drawingml/2006/picture">
+                  <pic:nvPicPr>
+                    <pic:cNvPr id="1459280952" name=""/>
+                    <pic:cNvPicPr/>
+                  </pic:nvPicPr>
+                  <pic:blipFill>
+                    <a:blip r:embed="rId13"/>
+                    <a:stretch>
+                      <a:fillRect/>
+                    </a:stretch>
+                  </pic:blipFill>
+                  <pic:spPr>
+                    <a:xfrm>
+                      <a:off x="0" y="0"/>
+                      <a:ext cx="1435239" cy="1797773"/>
+                    </a:xfrm>
+                    <a:prstGeom prst="rect">
+                      <a:avLst/>
+                    </a:prstGeom>
+                  </pic:spPr>
+                </pic:pic>
+              </a:graphicData>
+            </a:graphic>
+          </wp:inline>
+        </w:drawing>
+      </w:r>
+    </w:p>
+    <w:p>
+      <w:pPr>
+        <w:rPr>
+          <w:noProof/>
+        </w:rPr>
+      </w:pPr>
+      <w:r>
+        <w:rPr>
+          <w:noProof/>
+        </w:rPr>
         <w:t>f’c:</w:t>
       </w:r>
       <w:r>
@@ -772,6 +961,53 @@
         <w:rPr>
           <w:noProof/>
         </w:rPr>
+        <w:drawing>
+          <wp:inline distT="0" distB="0" distL="0" distR="0" wp14:anchorId="29FFCDDF" wp14:editId="693D5F63">
+            <wp:extent cx="1215858" cy="1943100"/>
+            <wp:effectExtent l="0" t="0" r="3810" b="0"/>
+            <wp:docPr id="1612492084" name="Picture 1"/>
+            <wp:cNvGraphicFramePr>
+              <a:graphicFrameLocks xmlns:a="http://schemas.openxmlformats.org/drawingml/2006/main" noChangeAspect="1"/>
+            </wp:cNvGraphicFramePr>
+            <a:graphic xmlns:a="http://schemas.openxmlformats.org/drawingml/2006/main">
+              <a:graphicData uri="http://schemas.openxmlformats.org/drawingml/2006/picture">
+                <pic:pic xmlns:pic="http://schemas.openxmlformats.org/drawingml/2006/picture">
+                  <pic:nvPicPr>
+                    <pic:cNvPr id="1612492084" name=""/>
+                    <pic:cNvPicPr/>
+                  </pic:nvPicPr>
+                  <pic:blipFill>
+                    <a:blip r:embed="rId14"/>
+                    <a:stretch>
+                      <a:fillRect/>
+                    </a:stretch>
+                  </pic:blipFill>
+                  <pic:spPr>
+                    <a:xfrm>
+                      <a:off x="0" y="0"/>
+                      <a:ext cx="1221736" cy="1952494"/>
+                    </a:xfrm>
+                    <a:prstGeom prst="rect">
+                      <a:avLst/>
+                    </a:prstGeom>
+                  </pic:spPr>
+                </pic:pic>
+              </a:graphicData>
+            </a:graphic>
+          </wp:inline>
+        </w:drawing>
+      </w:r>
+    </w:p>
+    <w:p>
+      <w:pPr>
+        <w:rPr>
+          <w:noProof/>
+        </w:rPr>
+      </w:pPr>
+      <w:r>
+        <w:rPr>
+          <w:noProof/>
+        </w:rPr>
         <w:t>length total: The full length of the beam in (ft.)</w:t>
       </w:r>
     </w:p>
@@ -785,6 +1021,54 @@
         <w:rPr>
           <w:noProof/>
         </w:rPr>
+        <w:drawing>
+          <wp:inline distT="0" distB="0" distL="0" distR="0" wp14:anchorId="55122CF6" wp14:editId="27AF3815">
+            <wp:extent cx="2758440" cy="1176240"/>
+            <wp:effectExtent l="0" t="0" r="3810" b="5080"/>
+            <wp:docPr id="1287122406" name="Picture 1"/>
+            <wp:cNvGraphicFramePr>
+              <a:graphicFrameLocks xmlns:a="http://schemas.openxmlformats.org/drawingml/2006/main" noChangeAspect="1"/>
+            </wp:cNvGraphicFramePr>
+            <a:graphic xmlns:a="http://schemas.openxmlformats.org/drawingml/2006/main">
+              <a:graphicData uri="http://schemas.openxmlformats.org/drawingml/2006/picture">
+                <pic:pic xmlns:pic="http://schemas.openxmlformats.org/drawingml/2006/picture">
+                  <pic:nvPicPr>
+                    <pic:cNvPr id="1287122406" name=""/>
+                    <pic:cNvPicPr/>
+                  </pic:nvPicPr>
+                  <pic:blipFill>
+                    <a:blip r:embed="rId15"/>
+                    <a:stretch>
+                      <a:fillRect/>
+                    </a:stretch>
+                  </pic:blipFill>
+                  <pic:spPr>
+                    <a:xfrm>
+                      <a:off x="0" y="0"/>
+                      <a:ext cx="2772605" cy="1182280"/>
+                    </a:xfrm>
+                    <a:prstGeom prst="rect">
+                      <a:avLst/>
+                    </a:prstGeom>
+                  </pic:spPr>
+                </pic:pic>
+              </a:graphicData>
+            </a:graphic>
+          </wp:inline>
+        </w:drawing>
+      </w:r>
+    </w:p>
+    <w:p>
+      <w:pPr>
+        <w:rPr>
+          <w:noProof/>
+        </w:rPr>
+      </w:pPr>
+      <w:r>
+        <w:rPr>
+          <w:noProof/>
+        </w:rPr>
+        <w:lastRenderedPageBreak/>
         <w:t>live load percent sustained: The</w:t>
       </w:r>
       <w:r>
@@ -874,6 +1158,53 @@
         <w:rPr>
           <w:noProof/>
         </w:rPr>
+        <w:drawing>
+          <wp:inline distT="0" distB="0" distL="0" distR="0" wp14:anchorId="403C498F" wp14:editId="04F2DB40">
+            <wp:extent cx="943402" cy="1805940"/>
+            <wp:effectExtent l="0" t="0" r="9525" b="3810"/>
+            <wp:docPr id="866113464" name="Picture 1"/>
+            <wp:cNvGraphicFramePr>
+              <a:graphicFrameLocks xmlns:a="http://schemas.openxmlformats.org/drawingml/2006/main" noChangeAspect="1"/>
+            </wp:cNvGraphicFramePr>
+            <a:graphic xmlns:a="http://schemas.openxmlformats.org/drawingml/2006/main">
+              <a:graphicData uri="http://schemas.openxmlformats.org/drawingml/2006/picture">
+                <pic:pic xmlns:pic="http://schemas.openxmlformats.org/drawingml/2006/picture">
+                  <pic:nvPicPr>
+                    <pic:cNvPr id="866113464" name=""/>
+                    <pic:cNvPicPr/>
+                  </pic:nvPicPr>
+                  <pic:blipFill>
+                    <a:blip r:embed="rId16"/>
+                    <a:stretch>
+                      <a:fillRect/>
+                    </a:stretch>
+                  </pic:blipFill>
+                  <pic:spPr>
+                    <a:xfrm>
+                      <a:off x="0" y="0"/>
+                      <a:ext cx="948576" cy="1815845"/>
+                    </a:xfrm>
+                    <a:prstGeom prst="rect">
+                      <a:avLst/>
+                    </a:prstGeom>
+                  </pic:spPr>
+                </pic:pic>
+              </a:graphicData>
+            </a:graphic>
+          </wp:inline>
+        </w:drawing>
+      </w:r>
+    </w:p>
+    <w:p>
+      <w:pPr>
+        <w:rPr>
+          <w:noProof/>
+        </w:rPr>
+      </w:pPr>
+      <w:r>
+        <w:rPr>
+          <w:noProof/>
+        </w:rPr>
         <w:t>stirrup leggs: The number of leggs a s</w:t>
       </w:r>
       <w:r>
@@ -958,121 +1289,135 @@
           <w:noProof/>
         </w:rPr>
       </w:pPr>
+    </w:p>
+    <w:p>
+      <w:pPr>
+        <w:rPr>
+          <w:noProof/>
+        </w:rPr>
+      </w:pPr>
+    </w:p>
+    <w:p>
+      <w:pPr>
+        <w:rPr>
+          <w:noProof/>
+        </w:rPr>
+      </w:pPr>
+      <w:r>
+        <w:rPr>
+          <w:noProof/>
+        </w:rPr>
+        <w:t>CMU Varriables:</w:t>
+      </w:r>
+    </w:p>
+    <w:p>
+      <w:pPr>
+        <w:rPr>
+          <w:noProof/>
+        </w:rPr>
+      </w:pPr>
+      <w:r>
+        <w:rPr>
+          <w:noProof/>
+        </w:rPr>
+        <w:t>Bar count horizontal: The number of bars going along the beam.</w:t>
+      </w:r>
+    </w:p>
+    <w:p>
+      <w:pPr>
+        <w:rPr>
+          <w:noProof/>
+        </w:rPr>
+      </w:pPr>
+      <w:r>
+        <w:rPr>
+          <w:noProof/>
+        </w:rPr>
+        <w:t>Bar size horizontal: The size of the bar going along the beam.</w:t>
+      </w:r>
+    </w:p>
+    <w:p>
+      <w:pPr>
+        <w:rPr>
+          <w:noProof/>
+        </w:rPr>
+      </w:pPr>
+      <w:r>
+        <w:rPr>
+          <w:noProof/>
+        </w:rPr>
+        <w:t>Bar size vertical: The size of the bar going vertically in the beam.</w:t>
+      </w:r>
+    </w:p>
+    <w:p>
+      <w:pPr>
+        <w:rPr>
+          <w:noProof/>
+        </w:rPr>
+      </w:pPr>
+      <w:r>
+        <w:rPr>
+          <w:noProof/>
+        </w:rPr>
+        <w:t>Beam Courses: The number of CMU bricks stacked that are in the beam.</w:t>
+      </w:r>
+    </w:p>
+    <w:p>
+      <w:pPr>
+        <w:rPr>
+          <w:noProof/>
+        </w:rPr>
+      </w:pPr>
+      <w:r>
+        <w:rPr>
+          <w:noProof/>
+        </w:rPr>
+        <w:t>CMU Size: The block size in the form _x_x_ with _ in (in.)</w:t>
+      </w:r>
+    </w:p>
+    <w:p>
+      <w:pPr>
+        <w:rPr>
+          <w:noProof/>
+        </w:rPr>
+      </w:pPr>
+      <w:r>
+        <w:rPr>
+          <w:noProof/>
+        </w:rPr>
+        <w:t xml:space="preserve">Dead load: Any </w:t>
+      </w:r>
+      <w:r>
+        <w:rPr>
+          <w:noProof/>
+        </w:rPr>
+        <w:t>perminate load that doesn’t include self weight. Units as asked for.</w:t>
+      </w:r>
+    </w:p>
+    <w:p>
+      <w:pPr>
+        <w:rPr>
+          <w:noProof/>
+        </w:rPr>
+      </w:pPr>
+      <w:r>
+        <w:rPr>
+          <w:noProof/>
+        </w:rPr>
+        <w:t>Es: Modulus of Elasticity. SHOULDN’T NEED TO CHANGE.</w:t>
+      </w:r>
+    </w:p>
+    <w:p>
+      <w:pPr>
+        <w:rPr>
+          <w:noProof/>
+        </w:rPr>
+      </w:pPr>
       <w:r>
         <w:rPr>
           <w:noProof/>
         </w:rPr>
         <w:lastRenderedPageBreak/>
-        <w:t>CMU Varriables:</w:t>
-      </w:r>
-    </w:p>
-    <w:p>
-      <w:pPr>
-        <w:rPr>
-          <w:noProof/>
-        </w:rPr>
-      </w:pPr>
-      <w:r>
-        <w:rPr>
-          <w:noProof/>
-        </w:rPr>
-        <w:t>Bar count horizontal: The number of bars going along the beam.</w:t>
-      </w:r>
-    </w:p>
-    <w:p>
-      <w:pPr>
-        <w:rPr>
-          <w:noProof/>
-        </w:rPr>
-      </w:pPr>
-      <w:r>
-        <w:rPr>
-          <w:noProof/>
-        </w:rPr>
-        <w:t>Bar size horizontal: The size of the bar going along the beam.</w:t>
-      </w:r>
-    </w:p>
-    <w:p>
-      <w:pPr>
-        <w:rPr>
-          <w:noProof/>
-        </w:rPr>
-      </w:pPr>
-      <w:r>
-        <w:rPr>
-          <w:noProof/>
-        </w:rPr>
-        <w:t>Bar size vertical: The size of the bar going vertically in the beam.</w:t>
-      </w:r>
-    </w:p>
-    <w:p>
-      <w:pPr>
-        <w:rPr>
-          <w:noProof/>
-        </w:rPr>
-      </w:pPr>
-      <w:r>
-        <w:rPr>
-          <w:noProof/>
-        </w:rPr>
-        <w:t>Beam Courses: The number of CMU bricks stacked that are in the beam.</w:t>
-      </w:r>
-    </w:p>
-    <w:p>
-      <w:pPr>
-        <w:rPr>
-          <w:noProof/>
-        </w:rPr>
-      </w:pPr>
-      <w:r>
-        <w:rPr>
-          <w:noProof/>
-        </w:rPr>
-        <w:t>CMU Size: The block size in the form _x_x_ with _ in (in.)</w:t>
-      </w:r>
-    </w:p>
-    <w:p>
-      <w:pPr>
-        <w:rPr>
-          <w:noProof/>
-        </w:rPr>
-      </w:pPr>
-      <w:r>
-        <w:rPr>
-          <w:noProof/>
-        </w:rPr>
-        <w:t xml:space="preserve">Dead load: Any </w:t>
-      </w:r>
-      <w:r>
-        <w:rPr>
-          <w:noProof/>
-        </w:rPr>
-        <w:t>perminate load that doesn’t include self weight. Units as asked for.</w:t>
-      </w:r>
-    </w:p>
-    <w:p>
-      <w:pPr>
-        <w:rPr>
-          <w:noProof/>
-        </w:rPr>
-      </w:pPr>
-      <w:r>
-        <w:rPr>
-          <w:noProof/>
-        </w:rPr>
-        <w:t>Es: Modulus of Elasticity. SHOULDN’T NEED TO CHANGE.</w:t>
-      </w:r>
-    </w:p>
-    <w:p>
-      <w:pPr>
-        <w:rPr>
-          <w:noProof/>
-        </w:rPr>
-      </w:pPr>
-      <w:r>
-        <w:rPr>
-          <w:noProof/>
-        </w:rPr>
         <w:t>Floor depth: How far the beam supports the wall</w:t>
       </w:r>
       <w:r>
@@ -1149,6 +1494,53 @@
         <w:rPr>
           <w:noProof/>
         </w:rPr>
+        <w:drawing>
+          <wp:inline distT="0" distB="0" distL="0" distR="0" wp14:anchorId="3F3BD817" wp14:editId="7141F7C9">
+            <wp:extent cx="1478280" cy="2071832"/>
+            <wp:effectExtent l="0" t="0" r="7620" b="5080"/>
+            <wp:docPr id="908617457" name="Picture 1"/>
+            <wp:cNvGraphicFramePr>
+              <a:graphicFrameLocks xmlns:a="http://schemas.openxmlformats.org/drawingml/2006/main" noChangeAspect="1"/>
+            </wp:cNvGraphicFramePr>
+            <a:graphic xmlns:a="http://schemas.openxmlformats.org/drawingml/2006/main">
+              <a:graphicData uri="http://schemas.openxmlformats.org/drawingml/2006/picture">
+                <pic:pic xmlns:pic="http://schemas.openxmlformats.org/drawingml/2006/picture">
+                  <pic:nvPicPr>
+                    <pic:cNvPr id="908617457" name=""/>
+                    <pic:cNvPicPr/>
+                  </pic:nvPicPr>
+                  <pic:blipFill>
+                    <a:blip r:embed="rId17"/>
+                    <a:stretch>
+                      <a:fillRect/>
+                    </a:stretch>
+                  </pic:blipFill>
+                  <pic:spPr>
+                    <a:xfrm>
+                      <a:off x="0" y="0"/>
+                      <a:ext cx="1483099" cy="2078587"/>
+                    </a:xfrm>
+                    <a:prstGeom prst="rect">
+                      <a:avLst/>
+                    </a:prstGeom>
+                  </pic:spPr>
+                </pic:pic>
+              </a:graphicData>
+            </a:graphic>
+          </wp:inline>
+        </w:drawing>
+      </w:r>
+    </w:p>
+    <w:p>
+      <w:pPr>
+        <w:rPr>
+          <w:noProof/>
+        </w:rPr>
+      </w:pPr>
+      <w:r>
+        <w:rPr>
+          <w:noProof/>
+        </w:rPr>
         <w:t>Grout fill: The patern in which grout is placed in the CMU.</w:t>
       </w:r>
     </w:p>
@@ -1181,6 +1573,53 @@
         <w:rPr>
           <w:noProof/>
         </w:rPr>
+        <w:drawing>
+          <wp:inline distT="0" distB="0" distL="0" distR="0" wp14:anchorId="36F8BE66" wp14:editId="7FAD2D03">
+            <wp:extent cx="2758440" cy="1176240"/>
+            <wp:effectExtent l="0" t="0" r="3810" b="5080"/>
+            <wp:docPr id="1621144825" name="Picture 1"/>
+            <wp:cNvGraphicFramePr>
+              <a:graphicFrameLocks xmlns:a="http://schemas.openxmlformats.org/drawingml/2006/main" noChangeAspect="1"/>
+            </wp:cNvGraphicFramePr>
+            <a:graphic xmlns:a="http://schemas.openxmlformats.org/drawingml/2006/main">
+              <a:graphicData uri="http://schemas.openxmlformats.org/drawingml/2006/picture">
+                <pic:pic xmlns:pic="http://schemas.openxmlformats.org/drawingml/2006/picture">
+                  <pic:nvPicPr>
+                    <pic:cNvPr id="1287122406" name=""/>
+                    <pic:cNvPicPr/>
+                  </pic:nvPicPr>
+                  <pic:blipFill>
+                    <a:blip r:embed="rId15"/>
+                    <a:stretch>
+                      <a:fillRect/>
+                    </a:stretch>
+                  </pic:blipFill>
+                  <pic:spPr>
+                    <a:xfrm>
+                      <a:off x="0" y="0"/>
+                      <a:ext cx="2772605" cy="1182280"/>
+                    </a:xfrm>
+                    <a:prstGeom prst="rect">
+                      <a:avLst/>
+                    </a:prstGeom>
+                  </pic:spPr>
+                </pic:pic>
+              </a:graphicData>
+            </a:graphic>
+          </wp:inline>
+        </w:drawing>
+      </w:r>
+    </w:p>
+    <w:p>
+      <w:pPr>
+        <w:rPr>
+          <w:noProof/>
+        </w:rPr>
+      </w:pPr>
+      <w:r>
+        <w:rPr>
+          <w:noProof/>
+        </w:rPr>
         <w:t>Length Bearing: The length of bearing of the beam</w:t>
       </w:r>
       <w:r>
@@ -1200,6 +1639,53 @@
         <w:rPr>
           <w:noProof/>
         </w:rPr>
+        <w:drawing>
+          <wp:inline distT="0" distB="0" distL="0" distR="0" wp14:anchorId="0AB9FF2F" wp14:editId="2BD1B92B">
+            <wp:extent cx="2788920" cy="1316851"/>
+            <wp:effectExtent l="0" t="0" r="0" b="0"/>
+            <wp:docPr id="1118767685" name="Picture 1"/>
+            <wp:cNvGraphicFramePr>
+              <a:graphicFrameLocks xmlns:a="http://schemas.openxmlformats.org/drawingml/2006/main" noChangeAspect="1"/>
+            </wp:cNvGraphicFramePr>
+            <a:graphic xmlns:a="http://schemas.openxmlformats.org/drawingml/2006/main">
+              <a:graphicData uri="http://schemas.openxmlformats.org/drawingml/2006/picture">
+                <pic:pic xmlns:pic="http://schemas.openxmlformats.org/drawingml/2006/picture">
+                  <pic:nvPicPr>
+                    <pic:cNvPr id="1118767685" name=""/>
+                    <pic:cNvPicPr/>
+                  </pic:nvPicPr>
+                  <pic:blipFill>
+                    <a:blip r:embed="rId18"/>
+                    <a:stretch>
+                      <a:fillRect/>
+                    </a:stretch>
+                  </pic:blipFill>
+                  <pic:spPr>
+                    <a:xfrm>
+                      <a:off x="0" y="0"/>
+                      <a:ext cx="2809522" cy="1326579"/>
+                    </a:xfrm>
+                    <a:prstGeom prst="rect">
+                      <a:avLst/>
+                    </a:prstGeom>
+                  </pic:spPr>
+                </pic:pic>
+              </a:graphicData>
+            </a:graphic>
+          </wp:inline>
+        </w:drawing>
+      </w:r>
+    </w:p>
+    <w:p>
+      <w:pPr>
+        <w:rPr>
+          <w:noProof/>
+        </w:rPr>
+      </w:pPr>
+      <w:r>
+        <w:rPr>
+          <w:noProof/>
+        </w:rPr>
         <w:t xml:space="preserve">Mortar type: </w:t>
       </w:r>
       <w:r>
@@ -1256,6 +1742,7 @@
         <w:rPr>
           <w:noProof/>
         </w:rPr>
+        <w:lastRenderedPageBreak/>
         <w:t xml:space="preserve">Point load: </w:t>
       </w:r>
       <w:r>
@@ -1344,6 +1831,53 @@
         <w:rPr>
           <w:noProof/>
         </w:rPr>
+        <w:drawing>
+          <wp:inline distT="0" distB="0" distL="0" distR="0" wp14:anchorId="6CEE9BBF" wp14:editId="18D9E7D9">
+            <wp:extent cx="943402" cy="1805940"/>
+            <wp:effectExtent l="0" t="0" r="9525" b="3810"/>
+            <wp:docPr id="1423982262" name="Picture 1"/>
+            <wp:cNvGraphicFramePr>
+              <a:graphicFrameLocks xmlns:a="http://schemas.openxmlformats.org/drawingml/2006/main" noChangeAspect="1"/>
+            </wp:cNvGraphicFramePr>
+            <a:graphic xmlns:a="http://schemas.openxmlformats.org/drawingml/2006/main">
+              <a:graphicData uri="http://schemas.openxmlformats.org/drawingml/2006/picture">
+                <pic:pic xmlns:pic="http://schemas.openxmlformats.org/drawingml/2006/picture">
+                  <pic:nvPicPr>
+                    <pic:cNvPr id="866113464" name=""/>
+                    <pic:cNvPicPr/>
+                  </pic:nvPicPr>
+                  <pic:blipFill>
+                    <a:blip r:embed="rId16"/>
+                    <a:stretch>
+                      <a:fillRect/>
+                    </a:stretch>
+                  </pic:blipFill>
+                  <pic:spPr>
+                    <a:xfrm>
+                      <a:off x="0" y="0"/>
+                      <a:ext cx="948576" cy="1815845"/>
+                    </a:xfrm>
+                    <a:prstGeom prst="rect">
+                      <a:avLst/>
+                    </a:prstGeom>
+                  </pic:spPr>
+                </pic:pic>
+              </a:graphicData>
+            </a:graphic>
+          </wp:inline>
+        </w:drawing>
+      </w:r>
+    </w:p>
+    <w:p>
+      <w:pPr>
+        <w:rPr>
+          <w:noProof/>
+        </w:rPr>
+      </w:pPr>
+      <w:r>
+        <w:rPr>
+          <w:noProof/>
+        </w:rPr>
         <w:t>Support: What is the beams support condition. Either Cantilever or Simply Supported.</w:t>
       </w:r>
     </w:p>
@@ -1381,35 +1915,6 @@
           <w:noProof/>
         </w:rPr>
       </w:pPr>
-      <w:sdt>
-        <w:sdtPr>
-          <w:rPr>
-            <w:rFonts w:ascii="Cambria Math" w:hAnsi="Cambria Math"/>
-            <w:i/>
-            <w:noProof/>
-          </w:rPr>
-          <w:id w:val="-1555461241"/>
-          <w:placeholder>
-            <w:docPart w:val="DefaultPlaceholder_2098659789"/>
-          </w:placeholder>
-          <w:temporary/>
-          <w:showingPlcHdr/>
-          <w:equation/>
-        </w:sdtPr>
-        <w:sdtContent>
-          <m:oMathPara>
-            <m:oMath>
-              <m:r>
-                <w:rPr>
-                  <w:rStyle w:val="PlaceholderText"/>
-                  <w:rFonts w:ascii="Cambria Math" w:hAnsi="Cambria Math"/>
-                </w:rPr>
-                <m:t>Type equation here.</m:t>
-              </m:r>
-            </m:oMath>
-          </m:oMathPara>
-        </w:sdtContent>
-      </w:sdt>
     </w:p>
     <w:p>
       <w:pPr>
@@ -2366,559 +2871,6 @@
 </w:styles>
 </file>
 
-<file path=word/glossary/document.xml><?xml version="1.0" encoding="utf-8"?>
-<w:glossaryDocument xmlns:wpc="http://schemas.microsoft.com/office/word/2010/wordprocessingCanvas" xmlns:cx="http://schemas.microsoft.com/office/drawing/2014/chartex" xmlns:cx1="http://schemas.microsoft.com/office/drawing/2015/9/8/chartex" xmlns:cx2="http://schemas.microsoft.com/office/drawing/2015/10/21/chartex" xmlns:cx3="http://schemas.microsoft.com/office/drawing/2016/5/9/chartex" xmlns:cx4="http://schemas.microsoft.com/office/drawing/2016/5/10/chartex" xmlns:cx5="http://schemas.microsoft.com/office/drawing/2016/5/11/chartex" xmlns:cx6="http://schemas.microsoft.com/office/drawing/2016/5/12/chartex" xmlns:cx7="http://schemas.microsoft.com/office/drawing/2016/5/13/chartex" xmlns:cx8="http://schemas.microsoft.com/office/drawing/2016/5/14/chartex" xmlns:mc="http://schemas.openxmlformats.org/markup-compatibility/2006" xmlns:aink="http://schemas.microsoft.com/office/drawing/2016/ink" xmlns:am3d="http://schemas.microsoft.com/office/drawing/2017/model3d" xmlns:o="urn:schemas-microsoft-com:office:office" xmlns:oel="http://schemas.microsoft.com/office/2019/extlst" xmlns:r="http://schemas.openxmlformats.org/officeDocument/2006/relationships" xmlns:m="http://schemas.openxmlformats.org/officeDocument/2006/math" xmlns:v="urn:schemas-microsoft-com:vml" xmlns:wp14="http://schemas.microsoft.com/office/word/2010/wordprocessingDrawing" xmlns:wp="http://schemas.openxmlformats.org/drawingml/2006/wordprocessingDrawing" xmlns:w10="urn:schemas-microsoft-com:office:word" xmlns:w="http://schemas.openxmlformats.org/wordprocessingml/2006/main" xmlns:w14="http://schemas.microsoft.com/office/word/2010/wordml" xmlns:w15="http://schemas.microsoft.com/office/word/2012/wordml" xmlns:w16cex="http://schemas.microsoft.com/office/word/2018/wordml/cex" xmlns:w16cid="http://schemas.microsoft.com/office/word/2016/wordml/cid" xmlns:w16="http://schemas.microsoft.com/office/word/2018/wordml" xmlns:w16du="http://schemas.microsoft.com/office/word/2023/wordml/word16du" xmlns:w16sdtdh="http://schemas.microsoft.com/office/word/2020/wordml/sdtdatahash" xmlns:w16sdtfl="http://schemas.microsoft.com/office/word/2024/wordml/sdtformatlock" xmlns:w16se="http://schemas.microsoft.com/office/word/2015/wordml/symex" xmlns:wpg="http://schemas.microsoft.com/office/word/2010/wordprocessingGroup" xmlns:wpi="http://schemas.microsoft.com/office/word/2010/wordprocessingInk" xmlns:wne="http://schemas.microsoft.com/office/word/2006/wordml" xmlns:wps="http://schemas.microsoft.com/office/word/2010/wordprocessingShape" mc:Ignorable="w14 w15 w16se w16cid w16 w16cex w16sdtdh w16sdtfl w16du wp14">
-  <w:docParts>
-    <w:docPart>
-      <w:docPartPr>
-        <w:name w:val="DefaultPlaceholder_2098659789"/>
-        <w:category>
-          <w:name w:val="General"/>
-          <w:gallery w:val="placeholder"/>
-        </w:category>
-        <w:types>
-          <w:type w:val="bbPlcHdr"/>
-        </w:types>
-        <w:behaviors>
-          <w:behavior w:val="content"/>
-        </w:behaviors>
-        <w:guid w:val="{FA17A42F-A9F6-43B8-9C83-73C9380C227C}"/>
-      </w:docPartPr>
-      <w:docPartBody>
-        <w:p>
-          <w:r>
-            <w:rPr>
-              <w:rStyle w:val="PlaceholderText"/>
-            </w:rPr>
-            <w:t>Type equation here.</w:t>
-          </w:r>
-        </w:p>
-      </w:docPartBody>
-    </w:docPart>
-  </w:docParts>
-</w:glossaryDocument>
-</file>
-
-<file path=word/glossary/fontTable.xml><?xml version="1.0" encoding="utf-8"?>
-<w:fonts xmlns:mc="http://schemas.openxmlformats.org/markup-compatibility/2006" xmlns:r="http://schemas.openxmlformats.org/officeDocument/2006/relationships" xmlns:w="http://schemas.openxmlformats.org/wordprocessingml/2006/main" xmlns:w14="http://schemas.microsoft.com/office/word/2010/wordml" xmlns:w15="http://schemas.microsoft.com/office/word/2012/wordml" xmlns:w16cex="http://schemas.microsoft.com/office/word/2018/wordml/cex" xmlns:w16cid="http://schemas.microsoft.com/office/word/2016/wordml/cid" xmlns:w16="http://schemas.microsoft.com/office/word/2018/wordml" xmlns:w16du="http://schemas.microsoft.com/office/word/2023/wordml/word16du" xmlns:w16sdtdh="http://schemas.microsoft.com/office/word/2020/wordml/sdtdatahash" xmlns:w16sdtfl="http://schemas.microsoft.com/office/word/2024/wordml/sdtformatlock" xmlns:w16se="http://schemas.microsoft.com/office/word/2015/wordml/symex" mc:Ignorable="w14 w15 w16se w16cid w16 w16cex w16sdtdh w16sdtfl w16du">
-  <w:font w:name="Aptos">
-    <w:charset w:val="00"/>
-    <w:family w:val="swiss"/>
-    <w:pitch w:val="variable"/>
-    <w:sig w:usb0="20000287" w:usb1="00000003" w:usb2="00000000" w:usb3="00000000" w:csb0="0000019F" w:csb1="00000000"/>
-  </w:font>
-  <w:font w:name="Times New Roman">
-    <w:panose1 w:val="02020603050405020304"/>
-    <w:charset w:val="00"/>
-    <w:family w:val="roman"/>
-    <w:pitch w:val="variable"/>
-    <w:sig w:usb0="E0002EFF" w:usb1="C000785B" w:usb2="00000009" w:usb3="00000000" w:csb0="000001FF" w:csb1="00000000"/>
-  </w:font>
-  <w:font w:name="Aptos Display">
-    <w:charset w:val="00"/>
-    <w:family w:val="swiss"/>
-    <w:pitch w:val="variable"/>
-    <w:sig w:usb0="20000287" w:usb1="00000003" w:usb2="00000000" w:usb3="00000000" w:csb0="0000019F" w:csb1="00000000"/>
-  </w:font>
-  <w:font w:name="Cambria Math">
-    <w:panose1 w:val="02040503050406030204"/>
-    <w:charset w:val="00"/>
-    <w:family w:val="roman"/>
-    <w:pitch w:val="variable"/>
-    <w:sig w:usb0="E00006FF" w:usb1="420024FF" w:usb2="02000000" w:usb3="00000000" w:csb0="0000019F" w:csb1="00000000"/>
-  </w:font>
-</w:fonts>
-</file>
-
-<file path=word/glossary/settings.xml><?xml version="1.0" encoding="utf-8"?>
-<w:settings xmlns:mc="http://schemas.openxmlformats.org/markup-compatibility/2006" xmlns:o="urn:schemas-microsoft-com:office:office" xmlns:r="http://schemas.openxmlformats.org/officeDocument/2006/relationships" xmlns:m="http://schemas.openxmlformats.org/officeDocument/2006/math" xmlns:v="urn:schemas-microsoft-com:vml" xmlns:w10="urn:schemas-microsoft-com:office:word" xmlns:w="http://schemas.openxmlformats.org/wordprocessingml/2006/main" xmlns:w14="http://schemas.microsoft.com/office/word/2010/wordml" xmlns:w15="http://schemas.microsoft.com/office/word/2012/wordml" xmlns:w16cex="http://schemas.microsoft.com/office/word/2018/wordml/cex" xmlns:w16cid="http://schemas.microsoft.com/office/word/2016/wordml/cid" xmlns:w16="http://schemas.microsoft.com/office/word/2018/wordml" xmlns:w16du="http://schemas.microsoft.com/office/word/2023/wordml/word16du" xmlns:w16sdtdh="http://schemas.microsoft.com/office/word/2020/wordml/sdtdatahash" xmlns:w16sdtfl="http://schemas.microsoft.com/office/word/2024/wordml/sdtformatlock" xmlns:w16se="http://schemas.microsoft.com/office/word/2015/wordml/symex" xmlns:sl="http://schemas.openxmlformats.org/schemaLibrary/2006/main" mc:Ignorable="w14 w15 w16se w16cid w16 w16cex w16sdtdh w16sdtfl w16du">
-  <w:view w:val="normal"/>
-  <w:defaultTabStop w:val="720"/>
-  <w:characterSpacingControl w:val="doNotCompress"/>
-  <w:compat>
-    <w:useFELayout/>
-    <w:compatSetting w:name="compatibilityMode" w:uri="http://schemas.microsoft.com/office/word" w:val="15"/>
-    <w:compatSetting w:name="overrideTableStyleFontSizeAndJustification" w:uri="http://schemas.microsoft.com/office/word" w:val="1"/>
-    <w:compatSetting w:name="enableOpenTypeFeatures" w:uri="http://schemas.microsoft.com/office/word" w:val="1"/>
-    <w:compatSetting w:name="doNotFlipMirrorIndents" w:uri="http://schemas.microsoft.com/office/word" w:val="1"/>
-    <w:compatSetting w:name="differentiateMultirowTableHeaders" w:uri="http://schemas.microsoft.com/office/word" w:val="1"/>
-    <w:compatSetting w:name="useWord2013TrackBottomHyphenation" w:uri="http://schemas.microsoft.com/office/word" w:val="0"/>
-  </w:compat>
-  <w:rsids>
-    <w:rsidRoot w:val="00D71872"/>
-    <w:rsid w:val="00081F08"/>
-    <w:rsid w:val="006D0D95"/>
-    <w:rsid w:val="00D71872"/>
-  </w:rsids>
-  <m:mathPr>
-    <m:mathFont m:val="Cambria Math"/>
-    <m:brkBin m:val="before"/>
-    <m:brkBinSub m:val="--"/>
-    <m:smallFrac m:val="0"/>
-    <m:dispDef/>
-    <m:lMargin m:val="0"/>
-    <m:rMargin m:val="0"/>
-    <m:defJc m:val="centerGroup"/>
-    <m:wrapIndent m:val="1440"/>
-    <m:intLim m:val="subSup"/>
-    <m:naryLim m:val="undOvr"/>
-  </m:mathPr>
-  <w:themeFontLang w:val="en-US"/>
-  <w:clrSchemeMapping w:bg1="light1" w:t1="dark1" w:bg2="light2" w:t2="dark2" w:accent1="accent1" w:accent2="accent2" w:accent3="accent3" w:accent4="accent4" w:accent5="accent5" w:accent6="accent6" w:hyperlink="hyperlink" w:followedHyperlink="followedHyperlink"/>
-  <w:decimalSymbol w:val="."/>
-  <w:listSeparator w:val=","/>
-  <w15:chartTrackingRefBased/>
-</w:settings>
-</file>
-
-<file path=word/glossary/styles.xml><?xml version="1.0" encoding="utf-8"?>
-<w:styles xmlns:mc="http://schemas.openxmlformats.org/markup-compatibility/2006" xmlns:r="http://schemas.openxmlformats.org/officeDocument/2006/relationships" xmlns:w="http://schemas.openxmlformats.org/wordprocessingml/2006/main" xmlns:w14="http://schemas.microsoft.com/office/word/2010/wordml" xmlns:w15="http://schemas.microsoft.com/office/word/2012/wordml" xmlns:w16cex="http://schemas.microsoft.com/office/word/2018/wordml/cex" xmlns:w16cid="http://schemas.microsoft.com/office/word/2016/wordml/cid" xmlns:w16="http://schemas.microsoft.com/office/word/2018/wordml" xmlns:w16du="http://schemas.microsoft.com/office/word/2023/wordml/word16du" xmlns:w16sdtdh="http://schemas.microsoft.com/office/word/2020/wordml/sdtdatahash" xmlns:w16sdtfl="http://schemas.microsoft.com/office/word/2024/wordml/sdtformatlock" xmlns:w16se="http://schemas.microsoft.com/office/word/2015/wordml/symex" mc:Ignorable="w14 w15 w16se w16cid w16 w16cex w16sdtdh w16sdtfl w16du">
-  <w:docDefaults>
-    <w:rPrDefault>
-      <w:rPr>
-        <w:rFonts w:asciiTheme="minorHAnsi" w:eastAsiaTheme="minorEastAsia" w:hAnsiTheme="minorHAnsi" w:cstheme="minorBidi"/>
-        <w:kern w:val="2"/>
-        <w:sz w:val="24"/>
-        <w:szCs w:val="24"/>
-        <w:lang w:val="en-US" w:eastAsia="en-US" w:bidi="ar-SA"/>
-        <w14:ligatures w14:val="standardContextual"/>
-      </w:rPr>
-    </w:rPrDefault>
-    <w:pPrDefault>
-      <w:pPr>
-        <w:spacing w:after="160" w:line="278" w:lineRule="auto"/>
-      </w:pPr>
-    </w:pPrDefault>
-  </w:docDefaults>
-  <w:latentStyles w:defLockedState="0" w:defUIPriority="99" w:defSemiHidden="0" w:defUnhideWhenUsed="0" w:defQFormat="0" w:count="376">
-    <w:lsdException w:name="Normal" w:uiPriority="0" w:qFormat="1"/>
-    <w:lsdException w:name="heading 1" w:uiPriority="9" w:qFormat="1"/>
-    <w:lsdException w:name="heading 2" w:semiHidden="1" w:uiPriority="9" w:unhideWhenUsed="1" w:qFormat="1"/>
-    <w:lsdException w:name="heading 3" w:semiHidden="1" w:uiPriority="9" w:unhideWhenUsed="1" w:qFormat="1"/>
-    <w:lsdException w:name="heading 4" w:semiHidden="1" w:uiPriority="9" w:unhideWhenUsed="1" w:qFormat="1"/>
-    <w:lsdException w:name="heading 5" w:semiHidden="1" w:uiPriority="9" w:unhideWhenUsed="1" w:qFormat="1"/>
-    <w:lsdException w:name="heading 6" w:semiHidden="1" w:uiPriority="9" w:unhideWhenUsed="1" w:qFormat="1"/>
-    <w:lsdException w:name="heading 7" w:semiHidden="1" w:uiPriority="9" w:unhideWhenUsed="1" w:qFormat="1"/>
-    <w:lsdException w:name="heading 8" w:semiHidden="1" w:uiPriority="9" w:unhideWhenUsed="1" w:qFormat="1"/>
-    <w:lsdException w:name="heading 9" w:semiHidden="1" w:uiPriority="9" w:unhideWhenUsed="1" w:qFormat="1"/>
-    <w:lsdException w:name="index 1" w:semiHidden="1" w:unhideWhenUsed="1"/>
-    <w:lsdException w:name="index 2" w:semiHidden="1" w:unhideWhenUsed="1"/>
-    <w:lsdException w:name="index 3" w:semiHidden="1" w:unhideWhenUsed="1"/>
-    <w:lsdException w:name="index 4" w:semiHidden="1" w:unhideWhenUsed="1"/>
-    <w:lsdException w:name="index 5" w:semiHidden="1" w:unhideWhenUsed="1"/>
-    <w:lsdException w:name="index 6" w:semiHidden="1" w:unhideWhenUsed="1"/>
-    <w:lsdException w:name="index 7" w:semiHidden="1" w:unhideWhenUsed="1"/>
-    <w:lsdException w:name="index 8" w:semiHidden="1" w:unhideWhenUsed="1"/>
-    <w:lsdException w:name="index 9" w:semiHidden="1" w:unhideWhenUsed="1"/>
-    <w:lsdException w:name="toc 1" w:semiHidden="1" w:uiPriority="39" w:unhideWhenUsed="1"/>
-    <w:lsdException w:name="toc 2" w:semiHidden="1" w:uiPriority="39" w:unhideWhenUsed="1"/>
-    <w:lsdException w:name="toc 3" w:semiHidden="1" w:uiPriority="39" w:unhideWhenUsed="1"/>
-    <w:lsdException w:name="toc 4" w:semiHidden="1" w:uiPriority="39" w:unhideWhenUsed="1"/>
-    <w:lsdException w:name="toc 5" w:semiHidden="1" w:uiPriority="39" w:unhideWhenUsed="1"/>
-    <w:lsdException w:name="toc 6" w:semiHidden="1" w:uiPriority="39" w:unhideWhenUsed="1"/>
-    <w:lsdException w:name="toc 7" w:semiHidden="1" w:uiPriority="39" w:unhideWhenUsed="1"/>
-    <w:lsdException w:name="toc 8" w:semiHidden="1" w:uiPriority="39" w:unhideWhenUsed="1"/>
-    <w:lsdException w:name="toc 9" w:semiHidden="1" w:uiPriority="39" w:unhideWhenUsed="1"/>
-    <w:lsdException w:name="Normal Indent" w:semiHidden="1" w:unhideWhenUsed="1"/>
-    <w:lsdException w:name="footnote text" w:semiHidden="1" w:unhideWhenUsed="1"/>
-    <w:lsdException w:name="annotation text" w:semiHidden="1" w:unhideWhenUsed="1"/>
-    <w:lsdException w:name="header" w:semiHidden="1" w:unhideWhenUsed="1"/>
-    <w:lsdException w:name="footer" w:semiHidden="1" w:unhideWhenUsed="1"/>
-    <w:lsdException w:name="index heading" w:semiHidden="1" w:unhideWhenUsed="1"/>
-    <w:lsdException w:name="caption" w:semiHidden="1" w:uiPriority="35" w:unhideWhenUsed="1" w:qFormat="1"/>
-    <w:lsdException w:name="table of figures" w:semiHidden="1" w:unhideWhenUsed="1"/>
-    <w:lsdException w:name="envelope address" w:semiHidden="1" w:unhideWhenUsed="1"/>
-    <w:lsdException w:name="envelope return" w:semiHidden="1" w:unhideWhenUsed="1"/>
-    <w:lsdException w:name="footnote reference" w:semiHidden="1" w:unhideWhenUsed="1"/>
-    <w:lsdException w:name="annotation reference" w:semiHidden="1" w:unhideWhenUsed="1"/>
-    <w:lsdException w:name="line number" w:semiHidden="1" w:unhideWhenUsed="1"/>
-    <w:lsdException w:name="page number" w:semiHidden="1" w:unhideWhenUsed="1"/>
-    <w:lsdException w:name="endnote reference" w:semiHidden="1" w:unhideWhenUsed="1"/>
-    <w:lsdException w:name="endnote text" w:semiHidden="1" w:unhideWhenUsed="1"/>
-    <w:lsdException w:name="table of authorities" w:semiHidden="1" w:unhideWhenUsed="1"/>
-    <w:lsdException w:name="macro" w:semiHidden="1" w:unhideWhenUsed="1"/>
-    <w:lsdException w:name="toa heading" w:semiHidden="1" w:unhideWhenUsed="1"/>
-    <w:lsdException w:name="List" w:semiHidden="1" w:unhideWhenUsed="1"/>
-    <w:lsdException w:name="List Bullet" w:semiHidden="1" w:unhideWhenUsed="1"/>
-    <w:lsdException w:name="List Number" w:semiHidden="1" w:unhideWhenUsed="1"/>
-    <w:lsdException w:name="List 2" w:semiHidden="1" w:unhideWhenUsed="1"/>
-    <w:lsdException w:name="List 3" w:semiHidden="1" w:unhideWhenUsed="1"/>
-    <w:lsdException w:name="List 4" w:semiHidden="1" w:unhideWhenUsed="1"/>
-    <w:lsdException w:name="List 5" w:semiHidden="1" w:unhideWhenUsed="1"/>
-    <w:lsdException w:name="List Bullet 2" w:semiHidden="1" w:unhideWhenUsed="1"/>
-    <w:lsdException w:name="List Bullet 3" w:semiHidden="1" w:unhideWhenUsed="1"/>
-    <w:lsdException w:name="List Bullet 4" w:semiHidden="1" w:unhideWhenUsed="1"/>
-    <w:lsdException w:name="List Bullet 5" w:semiHidden="1" w:unhideWhenUsed="1"/>
-    <w:lsdException w:name="List Number 2" w:semiHidden="1" w:unhideWhenUsed="1"/>
-    <w:lsdException w:name="List Number 3" w:semiHidden="1" w:unhideWhenUsed="1"/>
-    <w:lsdException w:name="List Number 4" w:semiHidden="1" w:unhideWhenUsed="1"/>
-    <w:lsdException w:name="List Number 5" w:semiHidden="1" w:unhideWhenUsed="1"/>
-    <w:lsdException w:name="Title" w:uiPriority="10" w:qFormat="1"/>
-    <w:lsdException w:name="Closing" w:semiHidden="1" w:unhideWhenUsed="1"/>
-    <w:lsdException w:name="Signature" w:semiHidden="1" w:unhideWhenUsed="1"/>
-    <w:lsdException w:name="Default Paragraph Font" w:semiHidden="1" w:uiPriority="1" w:unhideWhenUsed="1"/>
-    <w:lsdException w:name="Body Text" w:semiHidden="1" w:unhideWhenUsed="1"/>
-    <w:lsdException w:name="Body Text Indent" w:semiHidden="1" w:unhideWhenUsed="1"/>
-    <w:lsdException w:name="List Continue" w:semiHidden="1" w:unhideWhenUsed="1"/>
-    <w:lsdException w:name="List Continue 2" w:semiHidden="1" w:unhideWhenUsed="1"/>
-    <w:lsdException w:name="List Continue 3" w:semiHidden="1" w:unhideWhenUsed="1"/>
-    <w:lsdException w:name="List Continue 4" w:semiHidden="1" w:unhideWhenUsed="1"/>
-    <w:lsdException w:name="List Continue 5" w:semiHidden="1" w:unhideWhenUsed="1"/>
-    <w:lsdException w:name="Message Header" w:semiHidden="1" w:unhideWhenUsed="1"/>
-    <w:lsdException w:name="Subtitle" w:uiPriority="11" w:qFormat="1"/>
-    <w:lsdException w:name="Salutation" w:semiHidden="1" w:unhideWhenUsed="1"/>
-    <w:lsdException w:name="Date" w:semiHidden="1" w:unhideWhenUsed="1"/>
-    <w:lsdException w:name="Body Text First Indent" w:semiHidden="1" w:unhideWhenUsed="1"/>
-    <w:lsdException w:name="Body Text First Indent 2" w:semiHidden="1" w:unhideWhenUsed="1"/>
-    <w:lsdException w:name="Note Heading" w:semiHidden="1" w:unhideWhenUsed="1"/>
-    <w:lsdException w:name="Body Text 2" w:semiHidden="1" w:unhideWhenUsed="1"/>
-    <w:lsdException w:name="Body Text 3" w:semiHidden="1" w:unhideWhenUsed="1"/>
-    <w:lsdException w:name="Body Text Indent 2" w:semiHidden="1" w:unhideWhenUsed="1"/>
-    <w:lsdException w:name="Body Text Indent 3" w:semiHidden="1" w:unhideWhenUsed="1"/>
-    <w:lsdException w:name="Block Text" w:semiHidden="1" w:unhideWhenUsed="1"/>
-    <w:lsdException w:name="Hyperlink" w:semiHidden="1" w:unhideWhenUsed="1"/>
-    <w:lsdException w:name="FollowedHyperlink" w:semiHidden="1" w:unhideWhenUsed="1"/>
-    <w:lsdException w:name="Strong" w:uiPriority="22" w:qFormat="1"/>
-    <w:lsdException w:name="Emphasis" w:uiPriority="20" w:qFormat="1"/>
-    <w:lsdException w:name="Document Map" w:semiHidden="1" w:unhideWhenUsed="1"/>
-    <w:lsdException w:name="Plain Text" w:semiHidden="1" w:unhideWhenUsed="1"/>
-    <w:lsdException w:name="E-mail Signature" w:semiHidden="1" w:unhideWhenUsed="1"/>
-    <w:lsdException w:name="HTML Top of Form" w:semiHidden="1" w:unhideWhenUsed="1"/>
-    <w:lsdException w:name="HTML Bottom of Form" w:semiHidden="1" w:unhideWhenUsed="1"/>
-    <w:lsdException w:name="Normal (Web)" w:semiHidden="1" w:unhideWhenUsed="1"/>
-    <w:lsdException w:name="HTML Acronym" w:semiHidden="1" w:unhideWhenUsed="1"/>
-    <w:lsdException w:name="HTML Address" w:semiHidden="1" w:unhideWhenUsed="1"/>
-    <w:lsdException w:name="HTML Cite" w:semiHidden="1" w:unhideWhenUsed="1"/>
-    <w:lsdException w:name="HTML Code" w:semiHidden="1" w:unhideWhenUsed="1"/>
-    <w:lsdException w:name="HTML Definition" w:semiHidden="1" w:unhideWhenUsed="1"/>
-    <w:lsdException w:name="HTML Keyboard" w:semiHidden="1" w:unhideWhenUsed="1"/>
-    <w:lsdException w:name="HTML Preformatted" w:semiHidden="1" w:unhideWhenUsed="1"/>
-    <w:lsdException w:name="HTML Sample" w:semiHidden="1" w:unhideWhenUsed="1"/>
-    <w:lsdException w:name="HTML Typewriter" w:semiHidden="1" w:unhideWhenUsed="1"/>
-    <w:lsdException w:name="HTML Variable" w:semiHidden="1" w:unhideWhenUsed="1"/>
-    <w:lsdException w:name="Normal Table" w:semiHidden="1" w:unhideWhenUsed="1"/>
-    <w:lsdException w:name="annotation subject" w:semiHidden="1" w:unhideWhenUsed="1"/>
-    <w:lsdException w:name="No List" w:semiHidden="1" w:unhideWhenUsed="1"/>
-    <w:lsdException w:name="Outline List 1" w:semiHidden="1" w:unhideWhenUsed="1"/>
-    <w:lsdException w:name="Outline List 2" w:semiHidden="1" w:unhideWhenUsed="1"/>
-    <w:lsdException w:name="Outline List 3" w:semiHidden="1" w:unhideWhenUsed="1"/>
-    <w:lsdException w:name="Table Simple 1" w:semiHidden="1" w:unhideWhenUsed="1"/>
-    <w:lsdException w:name="Table Simple 2" w:semiHidden="1" w:unhideWhenUsed="1"/>
-    <w:lsdException w:name="Table Simple 3" w:semiHidden="1" w:unhideWhenUsed="1"/>
-    <w:lsdException w:name="Table Classic 1" w:semiHidden="1" w:unhideWhenUsed="1"/>
-    <w:lsdException w:name="Table Classic 2" w:semiHidden="1" w:unhideWhenUsed="1"/>
-    <w:lsdException w:name="Table Classic 3" w:semiHidden="1" w:unhideWhenUsed="1"/>
-    <w:lsdException w:name="Table Classic 4" w:semiHidden="1" w:unhideWhenUsed="1"/>
-    <w:lsdException w:name="Table Colorful 1" w:semiHidden="1" w:unhideWhenUsed="1"/>
-    <w:lsdException w:name="Table Colorful 2" w:semiHidden="1" w:unhideWhenUsed="1"/>
-    <w:lsdException w:name="Table Colorful 3" w:semiHidden="1" w:unhideWhenUsed="1"/>
-    <w:lsdException w:name="Table Columns 1" w:semiHidden="1" w:unhideWhenUsed="1"/>
-    <w:lsdException w:name="Table Columns 2" w:semiHidden="1" w:unhideWhenUsed="1"/>
-    <w:lsdException w:name="Table Columns 3" w:semiHidden="1" w:unhideWhenUsed="1"/>
-    <w:lsdException w:name="Table Columns 4" w:semiHidden="1" w:unhideWhenUsed="1"/>
-    <w:lsdException w:name="Table Columns 5" w:semiHidden="1" w:unhideWhenUsed="1"/>
-    <w:lsdException w:name="Table Grid 1" w:semiHidden="1" w:unhideWhenUsed="1"/>
-    <w:lsdException w:name="Table Grid 2" w:semiHidden="1" w:unhideWhenUsed="1"/>
-    <w:lsdException w:name="Table Grid 3" w:semiHidden="1" w:unhideWhenUsed="1"/>
-    <w:lsdException w:name="Table Grid 4" w:semiHidden="1" w:unhideWhenUsed="1"/>
-    <w:lsdException w:name="Table Grid 5" w:semiHidden="1" w:unhideWhenUsed="1"/>
-    <w:lsdException w:name="Table Grid 6" w:semiHidden="1" w:unhideWhenUsed="1"/>
-    <w:lsdException w:name="Table Grid 7" w:semiHidden="1" w:unhideWhenUsed="1"/>
-    <w:lsdException w:name="Table Grid 8" w:semiHidden="1" w:unhideWhenUsed="1"/>
-    <w:lsdException w:name="Table List 1" w:semiHidden="1" w:unhideWhenUsed="1"/>
-    <w:lsdException w:name="Table List 2" w:semiHidden="1" w:unhideWhenUsed="1"/>
-    <w:lsdException w:name="Table List 3" w:semiHidden="1" w:unhideWhenUsed="1"/>
-    <w:lsdException w:name="Table List 4" w:semiHidden="1" w:unhideWhenUsed="1"/>
-    <w:lsdException w:name="Table List 5" w:semiHidden="1" w:unhideWhenUsed="1"/>
-    <w:lsdException w:name="Table List 6" w:semiHidden="1" w:unhideWhenUsed="1"/>
-    <w:lsdException w:name="Table List 7" w:semiHidden="1" w:unhideWhenUsed="1"/>
-    <w:lsdException w:name="Table List 8" w:semiHidden="1" w:unhideWhenUsed="1"/>
-    <w:lsdException w:name="Table 3D effects 1" w:semiHidden="1" w:unhideWhenUsed="1"/>
-    <w:lsdException w:name="Table 3D effects 2" w:semiHidden="1" w:unhideWhenUsed="1"/>
-    <w:lsdException w:name="Table 3D effects 3" w:semiHidden="1" w:unhideWhenUsed="1"/>
-    <w:lsdException w:name="Table Contemporary" w:semiHidden="1" w:unhideWhenUsed="1"/>
-    <w:lsdException w:name="Table Elegant" w:semiHidden="1" w:unhideWhenUsed="1"/>
-    <w:lsdException w:name="Table Professional" w:semiHidden="1" w:unhideWhenUsed="1"/>
-    <w:lsdException w:name="Table Subtle 1" w:semiHidden="1" w:unhideWhenUsed="1"/>
-    <w:lsdException w:name="Table Subtle 2" w:semiHidden="1" w:unhideWhenUsed="1"/>
-    <w:lsdException w:name="Table Web 1" w:semiHidden="1" w:unhideWhenUsed="1"/>
-    <w:lsdException w:name="Table Web 2" w:semiHidden="1" w:unhideWhenUsed="1"/>
-    <w:lsdException w:name="Table Web 3" w:semiHidden="1" w:unhideWhenUsed="1"/>
-    <w:lsdException w:name="Balloon Text" w:semiHidden="1" w:unhideWhenUsed="1"/>
-    <w:lsdException w:name="Table Grid" w:uiPriority="39"/>
-    <w:lsdException w:name="Table Theme" w:semiHidden="1" w:unhideWhenUsed="1"/>
-    <w:lsdException w:name="Placeholder Text" w:semiHidden="1"/>
-    <w:lsdException w:name="No Spacing" w:uiPriority="1" w:qFormat="1"/>
-    <w:lsdException w:name="Light Shading" w:uiPriority="60"/>
-    <w:lsdException w:name="Light List" w:uiPriority="61"/>
-    <w:lsdException w:name="Light Grid" w:uiPriority="62"/>
-    <w:lsdException w:name="Medium Shading 1" w:uiPriority="63"/>
-    <w:lsdException w:name="Medium Shading 2" w:uiPriority="64"/>
-    <w:lsdException w:name="Medium List 1" w:uiPriority="65"/>
-    <w:lsdException w:name="Medium List 2" w:uiPriority="66"/>
-    <w:lsdException w:name="Medium Grid 1" w:uiPriority="67"/>
-    <w:lsdException w:name="Medium Grid 2" w:uiPriority="68"/>
-    <w:lsdException w:name="Medium Grid 3" w:uiPriority="69"/>
-    <w:lsdException w:name="Dark List" w:uiPriority="70"/>
-    <w:lsdException w:name="Colorful Shading" w:uiPriority="71"/>
-    <w:lsdException w:name="Colorful List" w:uiPriority="72"/>
-    <w:lsdException w:name="Colorful Grid" w:uiPriority="73"/>
-    <w:lsdException w:name="Light Shading Accent 1" w:uiPriority="60"/>
-    <w:lsdException w:name="Light List Accent 1" w:uiPriority="61"/>
-    <w:lsdException w:name="Light Grid Accent 1" w:uiPriority="62"/>
-    <w:lsdException w:name="Medium Shading 1 Accent 1" w:uiPriority="63"/>
-    <w:lsdException w:name="Medium Shading 2 Accent 1" w:uiPriority="64"/>
-    <w:lsdException w:name="Medium List 1 Accent 1" w:uiPriority="65"/>
-    <w:lsdException w:name="Revision" w:semiHidden="1"/>
-    <w:lsdException w:name="List Paragraph" w:uiPriority="34" w:qFormat="1"/>
-    <w:lsdException w:name="Quote" w:uiPriority="29" w:qFormat="1"/>
-    <w:lsdException w:name="Intense Quote" w:uiPriority="30" w:qFormat="1"/>
-    <w:lsdException w:name="Medium List 2 Accent 1" w:uiPriority="66"/>
-    <w:lsdException w:name="Medium Grid 1 Accent 1" w:uiPriority="67"/>
-    <w:lsdException w:name="Medium Grid 2 Accent 1" w:uiPriority="68"/>
-    <w:lsdException w:name="Medium Grid 3 Accent 1" w:uiPriority="69"/>
-    <w:lsdException w:name="Dark List Accent 1" w:uiPriority="70"/>
-    <w:lsdException w:name="Colorful Shading Accent 1" w:uiPriority="71"/>
-    <w:lsdException w:name="Colorful List Accent 1" w:uiPriority="72"/>
-    <w:lsdException w:name="Colorful Grid Accent 1" w:uiPriority="73"/>
-    <w:lsdException w:name="Light Shading Accent 2" w:uiPriority="60"/>
-    <w:lsdException w:name="Light List Accent 2" w:uiPriority="61"/>
-    <w:lsdException w:name="Light Grid Accent 2" w:uiPriority="62"/>
-    <w:lsdException w:name="Medium Shading 1 Accent 2" w:uiPriority="63"/>
-    <w:lsdException w:name="Medium Shading 2 Accent 2" w:uiPriority="64"/>
-    <w:lsdException w:name="Medium List 1 Accent 2" w:uiPriority="65"/>
-    <w:lsdException w:name="Medium List 2 Accent 2" w:uiPriority="66"/>
-    <w:lsdException w:name="Medium Grid 1 Accent 2" w:uiPriority="67"/>
-    <w:lsdException w:name="Medium Grid 2 Accent 2" w:uiPriority="68"/>
-    <w:lsdException w:name="Medium Grid 3 Accent 2" w:uiPriority="69"/>
-    <w:lsdException w:name="Dark List Accent 2" w:uiPriority="70"/>
-    <w:lsdException w:name="Colorful Shading Accent 2" w:uiPriority="71"/>
-    <w:lsdException w:name="Colorful List Accent 2" w:uiPriority="72"/>
-    <w:lsdException w:name="Colorful Grid Accent 2" w:uiPriority="73"/>
-    <w:lsdException w:name="Light Shading Accent 3" w:uiPriority="60"/>
-    <w:lsdException w:name="Light List Accent 3" w:uiPriority="61"/>
-    <w:lsdException w:name="Light Grid Accent 3" w:uiPriority="62"/>
-    <w:lsdException w:name="Medium Shading 1 Accent 3" w:uiPriority="63"/>
-    <w:lsdException w:name="Medium Shading 2 Accent 3" w:uiPriority="64"/>
-    <w:lsdException w:name="Medium List 1 Accent 3" w:uiPriority="65"/>
-    <w:lsdException w:name="Medium List 2 Accent 3" w:uiPriority="66"/>
-    <w:lsdException w:name="Medium Grid 1 Accent 3" w:uiPriority="67"/>
-    <w:lsdException w:name="Medium Grid 2 Accent 3" w:uiPriority="68"/>
-    <w:lsdException w:name="Medium Grid 3 Accent 3" w:uiPriority="69"/>
-    <w:lsdException w:name="Dark List Accent 3" w:uiPriority="70"/>
-    <w:lsdException w:name="Colorful Shading Accent 3" w:uiPriority="71"/>
-    <w:lsdException w:name="Colorful List Accent 3" w:uiPriority="72"/>
-    <w:lsdException w:name="Colorful Grid Accent 3" w:uiPriority="73"/>
-    <w:lsdException w:name="Light Shading Accent 4" w:uiPriority="60"/>
-    <w:lsdException w:name="Light List Accent 4" w:uiPriority="61"/>
-    <w:lsdException w:name="Light Grid Accent 4" w:uiPriority="62"/>
-    <w:lsdException w:name="Medium Shading 1 Accent 4" w:uiPriority="63"/>
-    <w:lsdException w:name="Medium Shading 2 Accent 4" w:uiPriority="64"/>
-    <w:lsdException w:name="Medium List 1 Accent 4" w:uiPriority="65"/>
-    <w:lsdException w:name="Medium List 2 Accent 4" w:uiPriority="66"/>
-    <w:lsdException w:name="Medium Grid 1 Accent 4" w:uiPriority="67"/>
-    <w:lsdException w:name="Medium Grid 2 Accent 4" w:uiPriority="68"/>
-    <w:lsdException w:name="Medium Grid 3 Accent 4" w:uiPriority="69"/>
-    <w:lsdException w:name="Dark List Accent 4" w:uiPriority="70"/>
-    <w:lsdException w:name="Colorful Shading Accent 4" w:uiPriority="71"/>
-    <w:lsdException w:name="Colorful List Accent 4" w:uiPriority="72"/>
-    <w:lsdException w:name="Colorful Grid Accent 4" w:uiPriority="73"/>
-    <w:lsdException w:name="Light Shading Accent 5" w:uiPriority="60"/>
-    <w:lsdException w:name="Light List Accent 5" w:uiPriority="61"/>
-    <w:lsdException w:name="Light Grid Accent 5" w:uiPriority="62"/>
-    <w:lsdException w:name="Medium Shading 1 Accent 5" w:uiPriority="63"/>
-    <w:lsdException w:name="Medium Shading 2 Accent 5" w:uiPriority="64"/>
-    <w:lsdException w:name="Medium List 1 Accent 5" w:uiPriority="65"/>
-    <w:lsdException w:name="Medium List 2 Accent 5" w:uiPriority="66"/>
-    <w:lsdException w:name="Medium Grid 1 Accent 5" w:uiPriority="67"/>
-    <w:lsdException w:name="Medium Grid 2 Accent 5" w:uiPriority="68"/>
-    <w:lsdException w:name="Medium Grid 3 Accent 5" w:uiPriority="69"/>
-    <w:lsdException w:name="Dark List Accent 5" w:uiPriority="70"/>
-    <w:lsdException w:name="Colorful Shading Accent 5" w:uiPriority="71"/>
-    <w:lsdException w:name="Colorful List Accent 5" w:uiPriority="72"/>
-    <w:lsdException w:name="Colorful Grid Accent 5" w:uiPriority="73"/>
-    <w:lsdException w:name="Light Shading Accent 6" w:uiPriority="60"/>
-    <w:lsdException w:name="Light List Accent 6" w:uiPriority="61"/>
-    <w:lsdException w:name="Light Grid Accent 6" w:uiPriority="62"/>
-    <w:lsdException w:name="Medium Shading 1 Accent 6" w:uiPriority="63"/>
-    <w:lsdException w:name="Medium Shading 2 Accent 6" w:uiPriority="64"/>
-    <w:lsdException w:name="Medium List 1 Accent 6" w:uiPriority="65"/>
-    <w:lsdException w:name="Medium List 2 Accent 6" w:uiPriority="66"/>
-    <w:lsdException w:name="Medium Grid 1 Accent 6" w:uiPriority="67"/>
-    <w:lsdException w:name="Medium Grid 2 Accent 6" w:uiPriority="68"/>
-    <w:lsdException w:name="Medium Grid 3 Accent 6" w:uiPriority="69"/>
-    <w:lsdException w:name="Dark List Accent 6" w:uiPriority="70"/>
-    <w:lsdException w:name="Colorful Shading Accent 6" w:uiPriority="71"/>
-    <w:lsdException w:name="Colorful List Accent 6" w:uiPriority="72"/>
-    <w:lsdException w:name="Colorful Grid Accent 6" w:uiPriority="73"/>
-    <w:lsdException w:name="Subtle Emphasis" w:uiPriority="19" w:qFormat="1"/>
-    <w:lsdException w:name="Intense Emphasis" w:uiPriority="21" w:qFormat="1"/>
-    <w:lsdException w:name="Subtle Reference" w:uiPriority="31" w:qFormat="1"/>
-    <w:lsdException w:name="Intense Reference" w:uiPriority="32" w:qFormat="1"/>
-    <w:lsdException w:name="Book Title" w:uiPriority="33" w:qFormat="1"/>
-    <w:lsdException w:name="Bibliography" w:semiHidden="1" w:uiPriority="37" w:unhideWhenUsed="1"/>
-    <w:lsdException w:name="TOC Heading" w:semiHidden="1" w:uiPriority="39" w:unhideWhenUsed="1" w:qFormat="1"/>
-    <w:lsdException w:name="Plain Table 1" w:uiPriority="41"/>
-    <w:lsdException w:name="Plain Table 2" w:uiPriority="42"/>
-    <w:lsdException w:name="Plain Table 3" w:uiPriority="43"/>
-    <w:lsdException w:name="Plain Table 4" w:uiPriority="44"/>
-    <w:lsdException w:name="Plain Table 5" w:uiPriority="45"/>
-    <w:lsdException w:name="Grid Table Light" w:uiPriority="40"/>
-    <w:lsdException w:name="Grid Table 1 Light" w:uiPriority="46"/>
-    <w:lsdException w:name="Grid Table 2" w:uiPriority="47"/>
-    <w:lsdException w:name="Grid Table 3" w:uiPriority="48"/>
-    <w:lsdException w:name="Grid Table 4" w:uiPriority="49"/>
-    <w:lsdException w:name="Grid Table 5 Dark" w:uiPriority="50"/>
-    <w:lsdException w:name="Grid Table 6 Colorful" w:uiPriority="51"/>
-    <w:lsdException w:name="Grid Table 7 Colorful" w:uiPriority="52"/>
-    <w:lsdException w:name="Grid Table 1 Light Accent 1" w:uiPriority="46"/>
-    <w:lsdException w:name="Grid Table 2 Accent 1" w:uiPriority="47"/>
-    <w:lsdException w:name="Grid Table 3 Accent 1" w:uiPriority="48"/>
-    <w:lsdException w:name="Grid Table 4 Accent 1" w:uiPriority="49"/>
-    <w:lsdException w:name="Grid Table 5 Dark Accent 1" w:uiPriority="50"/>
-    <w:lsdException w:name="Grid Table 6 Colorful Accent 1" w:uiPriority="51"/>
-    <w:lsdException w:name="Grid Table 7 Colorful Accent 1" w:uiPriority="52"/>
-    <w:lsdException w:name="Grid Table 1 Light Accent 2" w:uiPriority="46"/>
-    <w:lsdException w:name="Grid Table 2 Accent 2" w:uiPriority="47"/>
-    <w:lsdException w:name="Grid Table 3 Accent 2" w:uiPriority="48"/>
-    <w:lsdException w:name="Grid Table 4 Accent 2" w:uiPriority="49"/>
-    <w:lsdException w:name="Grid Table 5 Dark Accent 2" w:uiPriority="50"/>
-    <w:lsdException w:name="Grid Table 6 Colorful Accent 2" w:uiPriority="51"/>
-    <w:lsdException w:name="Grid Table 7 Colorful Accent 2" w:uiPriority="52"/>
-    <w:lsdException w:name="Grid Table 1 Light Accent 3" w:uiPriority="46"/>
-    <w:lsdException w:name="Grid Table 2 Accent 3" w:uiPriority="47"/>
-    <w:lsdException w:name="Grid Table 3 Accent 3" w:uiPriority="48"/>
-    <w:lsdException w:name="Grid Table 4 Accent 3" w:uiPriority="49"/>
-    <w:lsdException w:name="Grid Table 5 Dark Accent 3" w:uiPriority="50"/>
-    <w:lsdException w:name="Grid Table 6 Colorful Accent 3" w:uiPriority="51"/>
-    <w:lsdException w:name="Grid Table 7 Colorful Accent 3" w:uiPriority="52"/>
-    <w:lsdException w:name="Grid Table 1 Light Accent 4" w:uiPriority="46"/>
-    <w:lsdException w:name="Grid Table 2 Accent 4" w:uiPriority="47"/>
-    <w:lsdException w:name="Grid Table 3 Accent 4" w:uiPriority="48"/>
-    <w:lsdException w:name="Grid Table 4 Accent 4" w:uiPriority="49"/>
-    <w:lsdException w:name="Grid Table 5 Dark Accent 4" w:uiPriority="50"/>
-    <w:lsdException w:name="Grid Table 6 Colorful Accent 4" w:uiPriority="51"/>
-    <w:lsdException w:name="Grid Table 7 Colorful Accent 4" w:uiPriority="52"/>
-    <w:lsdException w:name="Grid Table 1 Light Accent 5" w:uiPriority="46"/>
-    <w:lsdException w:name="Grid Table 2 Accent 5" w:uiPriority="47"/>
-    <w:lsdException w:name="Grid Table 3 Accent 5" w:uiPriority="48"/>
-    <w:lsdException w:name="Grid Table 4 Accent 5" w:uiPriority="49"/>
-    <w:lsdException w:name="Grid Table 5 Dark Accent 5" w:uiPriority="50"/>
-    <w:lsdException w:name="Grid Table 6 Colorful Accent 5" w:uiPriority="51"/>
-    <w:lsdException w:name="Grid Table 7 Colorful Accent 5" w:uiPriority="52"/>
-    <w:lsdException w:name="Grid Table 1 Light Accent 6" w:uiPriority="46"/>
-    <w:lsdException w:name="Grid Table 2 Accent 6" w:uiPriority="47"/>
-    <w:lsdException w:name="Grid Table 3 Accent 6" w:uiPriority="48"/>
-    <w:lsdException w:name="Grid Table 4 Accent 6" w:uiPriority="49"/>
-    <w:lsdException w:name="Grid Table 5 Dark Accent 6" w:uiPriority="50"/>
-    <w:lsdException w:name="Grid Table 6 Colorful Accent 6" w:uiPriority="51"/>
-    <w:lsdException w:name="Grid Table 7 Colorful Accent 6" w:uiPriority="52"/>
-    <w:lsdException w:name="List Table 1 Light" w:uiPriority="46"/>
-    <w:lsdException w:name="List Table 2" w:uiPriority="47"/>
-    <w:lsdException w:name="List Table 3" w:uiPriority="48"/>
-    <w:lsdException w:name="List Table 4" w:uiPriority="49"/>
-    <w:lsdException w:name="List Table 5 Dark" w:uiPriority="50"/>
-    <w:lsdException w:name="List Table 6 Colorful" w:uiPriority="51"/>
-    <w:lsdException w:name="List Table 7 Colorful" w:uiPriority="52"/>
-    <w:lsdException w:name="List Table 1 Light Accent 1" w:uiPriority="46"/>
-    <w:lsdException w:name="List Table 2 Accent 1" w:uiPriority="47"/>
-    <w:lsdException w:name="List Table 3 Accent 1" w:uiPriority="48"/>
-    <w:lsdException w:name="List Table 4 Accent 1" w:uiPriority="49"/>
-    <w:lsdException w:name="List Table 5 Dark Accent 1" w:uiPriority="50"/>
-    <w:lsdException w:name="List Table 6 Colorful Accent 1" w:uiPriority="51"/>
-    <w:lsdException w:name="List Table 7 Colorful Accent 1" w:uiPriority="52"/>
-    <w:lsdException w:name="List Table 1 Light Accent 2" w:uiPriority="46"/>
-    <w:lsdException w:name="List Table 2 Accent 2" w:uiPriority="47"/>
-    <w:lsdException w:name="List Table 3 Accent 2" w:uiPriority="48"/>
-    <w:lsdException w:name="List Table 4 Accent 2" w:uiPriority="49"/>
-    <w:lsdException w:name="List Table 5 Dark Accent 2" w:uiPriority="50"/>
-    <w:lsdException w:name="List Table 6 Colorful Accent 2" w:uiPriority="51"/>
-    <w:lsdException w:name="List Table 7 Colorful Accent 2" w:uiPriority="52"/>
-    <w:lsdException w:name="List Table 1 Light Accent 3" w:uiPriority="46"/>
-    <w:lsdException w:name="List Table 2 Accent 3" w:uiPriority="47"/>
-    <w:lsdException w:name="List Table 3 Accent 3" w:uiPriority="48"/>
-    <w:lsdException w:name="List Table 4 Accent 3" w:uiPriority="49"/>
-    <w:lsdException w:name="List Table 5 Dark Accent 3" w:uiPriority="50"/>
-    <w:lsdException w:name="List Table 6 Colorful Accent 3" w:uiPriority="51"/>
-    <w:lsdException w:name="List Table 7 Colorful Accent 3" w:uiPriority="52"/>
-    <w:lsdException w:name="List Table 1 Light Accent 4" w:uiPriority="46"/>
-    <w:lsdException w:name="List Table 2 Accent 4" w:uiPriority="47"/>
-    <w:lsdException w:name="List Table 3 Accent 4" w:uiPriority="48"/>
-    <w:lsdException w:name="List Table 4 Accent 4" w:uiPriority="49"/>
-    <w:lsdException w:name="List Table 5 Dark Accent 4" w:uiPriority="50"/>
-    <w:lsdException w:name="List Table 6 Colorful Accent 4" w:uiPriority="51"/>
-    <w:lsdException w:name="List Table 7 Colorful Accent 4" w:uiPriority="52"/>
-    <w:lsdException w:name="List Table 1 Light Accent 5" w:uiPriority="46"/>
-    <w:lsdException w:name="List Table 2 Accent 5" w:uiPriority="47"/>
-    <w:lsdException w:name="List Table 3 Accent 5" w:uiPriority="48"/>
-    <w:lsdException w:name="List Table 4 Accent 5" w:uiPriority="49"/>
-    <w:lsdException w:name="List Table 5 Dark Accent 5" w:uiPriority="50"/>
-    <w:lsdException w:name="List Table 6 Colorful Accent 5" w:uiPriority="51"/>
-    <w:lsdException w:name="List Table 7 Colorful Accent 5" w:uiPriority="52"/>
-    <w:lsdException w:name="List Table 1 Light Accent 6" w:uiPriority="46"/>
-    <w:lsdException w:name="List Table 2 Accent 6" w:uiPriority="47"/>
-    <w:lsdException w:name="List Table 3 Accent 6" w:uiPriority="48"/>
-    <w:lsdException w:name="List Table 4 Accent 6" w:uiPriority="49"/>
-    <w:lsdException w:name="List Table 5 Dark Accent 6" w:uiPriority="50"/>
-    <w:lsdException w:name="List Table 6 Colorful Accent 6" w:uiPriority="51"/>
-    <w:lsdException w:name="List Table 7 Colorful Accent 6" w:uiPriority="52"/>
-    <w:lsdException w:name="Mention" w:semiHidden="1" w:unhideWhenUsed="1"/>
-    <w:lsdException w:name="Smart Hyperlink" w:semiHidden="1" w:unhideWhenUsed="1"/>
-    <w:lsdException w:name="Hashtag" w:semiHidden="1" w:unhideWhenUsed="1"/>
-    <w:lsdException w:name="Unresolved Mention" w:semiHidden="1" w:unhideWhenUsed="1"/>
-    <w:lsdException w:name="Smart Link" w:semiHidden="1" w:unhideWhenUsed="1"/>
-  </w:latentStyles>
-  <w:style w:type="paragraph" w:default="1" w:styleId="Normal">
-    <w:name w:val="Normal"/>
-    <w:qFormat/>
-  </w:style>
-  <w:style w:type="character" w:default="1" w:styleId="DefaultParagraphFont">
-    <w:name w:val="Default Paragraph Font"/>
-    <w:uiPriority w:val="1"/>
-    <w:semiHidden/>
-    <w:unhideWhenUsed/>
-  </w:style>
-  <w:style w:type="table" w:default="1" w:styleId="TableNormal">
-    <w:name w:val="Normal Table"/>
-    <w:uiPriority w:val="99"/>
-    <w:semiHidden/>
-    <w:unhideWhenUsed/>
-    <w:tblPr>
-      <w:tblInd w:w="0" w:type="dxa"/>
-      <w:tblCellMar>
-        <w:top w:w="0" w:type="dxa"/>
-        <w:left w:w="108" w:type="dxa"/>
-        <w:bottom w:w="0" w:type="dxa"/>
-        <w:right w:w="108" w:type="dxa"/>
-      </w:tblCellMar>
-    </w:tblPr>
-  </w:style>
-  <w:style w:type="numbering" w:default="1" w:styleId="NoList">
-    <w:name w:val="No List"/>
-    <w:uiPriority w:val="99"/>
-    <w:semiHidden/>
-    <w:unhideWhenUsed/>
-  </w:style>
-  <w:style w:type="character" w:styleId="PlaceholderText">
-    <w:name w:val="Placeholder Text"/>
-    <w:basedOn w:val="DefaultParagraphFont"/>
-    <w:uiPriority w:val="99"/>
-    <w:semiHidden/>
-    <w:rsid w:val="00D71872"/>
-    <w:rPr>
-      <w:color w:val="666666"/>
-    </w:rPr>
-  </w:style>
-</w:styles>
-</file>
-
-<file path=word/glossary/webSettings.xml><?xml version="1.0" encoding="utf-8"?>
-<w:webSettings xmlns:mc="http://schemas.openxmlformats.org/markup-compatibility/2006" xmlns:r="http://schemas.openxmlformats.org/officeDocument/2006/relationships" xmlns:w="http://schemas.openxmlformats.org/wordprocessingml/2006/main" xmlns:w14="http://schemas.microsoft.com/office/word/2010/wordml" xmlns:w15="http://schemas.microsoft.com/office/word/2012/wordml" xmlns:w16cex="http://schemas.microsoft.com/office/word/2018/wordml/cex" xmlns:w16cid="http://schemas.microsoft.com/office/word/2016/wordml/cid" xmlns:w16="http://schemas.microsoft.com/office/word/2018/wordml" xmlns:w16du="http://schemas.microsoft.com/office/word/2023/wordml/word16du" xmlns:w16sdtdh="http://schemas.microsoft.com/office/word/2020/wordml/sdtdatahash" xmlns:w16sdtfl="http://schemas.microsoft.com/office/word/2024/wordml/sdtformatlock" xmlns:w16se="http://schemas.microsoft.com/office/word/2015/wordml/symex" mc:Ignorable="w14 w15 w16se w16cid w16 w16cex w16sdtdh w16sdtfl w16du">
-  <w:optimizeForBrowser/>
-  <w:allowPNG/>
-</w:webSettings>
-</file>
-
 <file path=word/theme/theme1.xml><?xml version="1.0" encoding="utf-8"?>
 <a:theme xmlns:a="http://schemas.openxmlformats.org/drawingml/2006/main" name="Office Theme">
   <a:themeElements>

</xml_diff>